<commit_message>
Further Deletions and Changes
</commit_message>
<xml_diff>
--- a/Notes.docx
+++ b/Notes.docx
@@ -18,17 +18,6 @@
     </w:p>
     <w:p>
       <w:r>
-        <w:t>(</w:t>
-      </w:r>
-      <w:r>
-        <w:t>-LQI Berechnung vom Empfänger</w:t>
-      </w:r>
-      <w:r>
-        <w:t>)</w:t>
-      </w:r>
-    </w:p>
-    <w:p>
-      <w:r>
         <w:t>-</w:t>
       </w:r>
       <w:r>
@@ -87,6 +76,20 @@
     <w:p>
       <w:pPr>
         <w:rPr>
+          <w:rFonts w:ascii="Calibri" w:hAnsi="Calibri" w:cs="Calibri"/>
+          <w:lang w:val="en-GB"/>
+        </w:rPr>
+      </w:pPr>
+      <w:r>
+        <w:rPr>
+          <w:lang w:val="en-GB"/>
+        </w:rPr>
+        <w:t>-change IsError.cs to use right Data</w:t>
+      </w:r>
+    </w:p>
+    <w:p>
+      <w:pPr>
+        <w:rPr>
           <w:lang w:val="en-GB"/>
         </w:rPr>
       </w:pPr>
@@ -147,27 +150,84 @@
         <w:rPr>
           <w:lang w:val="en-GB"/>
         </w:rPr>
+        <w:t>-moongen forward</w:t>
+      </w:r>
+    </w:p>
+    <w:p>
+      <w:pPr>
+        <w:rPr>
+          <w:rFonts w:ascii="Calibri" w:hAnsi="Calibri" w:cs="Calibri"/>
+          <w:lang w:val="en-GB"/>
+        </w:rPr>
+      </w:pPr>
+      <w:r>
+        <w:rPr>
+          <w:lang w:val="en-GB"/>
+        </w:rPr>
+        <w:t>-moongen receive</w:t>
+      </w:r>
+    </w:p>
+    <w:p>
+      <w:pPr>
+        <w:rPr>
+          <w:lang w:val="en-GB"/>
+        </w:rPr>
+      </w:pPr>
+      <w:r>
+        <w:rPr>
+          <w:lang w:val="en-GB"/>
+        </w:rPr>
         <w:t>-</w:t>
       </w:r>
-      <w:proofErr w:type="spellStart"/>
-      <w:r>
-        <w:rPr>
-          <w:lang w:val="en-GB"/>
-        </w:rPr>
-        <w:t>moongen</w:t>
-      </w:r>
-      <w:proofErr w:type="spellEnd"/>
-      <w:r>
-        <w:rPr>
-          <w:lang w:val="en-GB"/>
-        </w:rPr>
-        <w:t xml:space="preserve"> forward</w:t>
-      </w:r>
-      <w:r>
-        <w:rPr>
-          <w:lang w:val="en-GB"/>
-        </w:rPr>
-        <w:t xml:space="preserve">, </w:t>
+      <w:r>
+        <w:rPr>
+          <w:lang w:val="en-GB"/>
+        </w:rPr>
+        <w:t xml:space="preserve"> </w:t>
+      </w:r>
+      <w:r>
+        <w:rPr>
+          <w:lang w:val="en-GB"/>
+        </w:rPr>
+        <w:t>change MCS in Unity</w:t>
+      </w:r>
+    </w:p>
+    <w:p>
+      <w:pPr>
+        <w:rPr>
+          <w:lang w:val="en-GB"/>
+        </w:rPr>
+      </w:pPr>
+      <w:r>
+        <w:rPr>
+          <w:lang w:val="en-GB"/>
+        </w:rPr>
+        <w:t>-change HARQ in Unity</w:t>
+      </w:r>
+    </w:p>
+    <w:p>
+      <w:pPr>
+        <w:rPr>
+          <w:lang w:val="en-GB"/>
+        </w:rPr>
+      </w:pPr>
+      <w:r>
+        <w:rPr>
+          <w:lang w:val="en-GB"/>
+        </w:rPr>
+        <w:t>-DataRecorder.cs</w:t>
+      </w:r>
+      <w:r>
+        <w:rPr>
+          <w:lang w:val="en-GB"/>
+        </w:rPr>
+        <w:t xml:space="preserve"> //BER+SNR, thr</w:t>
+      </w:r>
+      <w:r>
+        <w:rPr>
+          <w:lang w:val="en-GB"/>
+        </w:rPr>
+        <w:t>oughput?</w:t>
       </w:r>
     </w:p>
     <w:p>
@@ -182,25 +242,17 @@
         </w:rPr>
         <w:t>-</w:t>
       </w:r>
-      <w:proofErr w:type="spellStart"/>
-      <w:r>
-        <w:rPr>
-          <w:lang w:val="en-GB"/>
-        </w:rPr>
-        <w:t>moongen</w:t>
-      </w:r>
-      <w:proofErr w:type="spellEnd"/>
-      <w:r>
-        <w:rPr>
-          <w:lang w:val="en-GB"/>
-        </w:rPr>
-        <w:t xml:space="preserve"> receive</w:t>
-      </w:r>
-      <w:r>
-        <w:rPr>
-          <w:lang w:val="en-GB"/>
-        </w:rPr>
-        <w:t xml:space="preserve"> (?)</w:t>
+      <w:r>
+        <w:rPr>
+          <w:lang w:val="en-GB"/>
+        </w:rPr>
+        <w:t>create new “UE” -&gt; FFD (+maybe RFD)</w:t>
+      </w:r>
+      <w:r>
+        <w:rPr>
+          <w:lang w:val="en-GB"/>
+        </w:rPr>
+        <w:t>?</w:t>
       </w:r>
     </w:p>
     <w:p>
@@ -219,27 +271,66 @@
         <w:rPr>
           <w:lang w:val="en-GB"/>
         </w:rPr>
-        <w:t xml:space="preserve">change </w:t>
-      </w:r>
-      <w:proofErr w:type="spellStart"/>
-      <w:r>
-        <w:rPr>
-          <w:lang w:val="en-GB"/>
-        </w:rPr>
-        <w:t>IsError</w:t>
-      </w:r>
-      <w:r>
-        <w:rPr>
-          <w:lang w:val="en-GB"/>
-        </w:rPr>
-        <w:t>.cs</w:t>
-      </w:r>
-      <w:proofErr w:type="spellEnd"/>
-      <w:r>
-        <w:rPr>
-          <w:lang w:val="en-GB"/>
-        </w:rPr>
-        <w:t xml:space="preserve"> to use right Data</w:t>
+        <w:t>change filepaths</w:t>
+      </w:r>
+    </w:p>
+    <w:p>
+      <w:pPr>
+        <w:rPr>
+          <w:lang w:val="en-GB"/>
+        </w:rPr>
+      </w:pPr>
+      <w:r>
+        <w:rPr>
+          <w:lang w:val="en-GB"/>
+        </w:rPr>
+        <w:t>-TxPower.cs</w:t>
+      </w:r>
+    </w:p>
+    <w:p>
+      <w:pPr>
+        <w:rPr>
+          <w:lang w:val="en-GB"/>
+        </w:rPr>
+      </w:pPr>
+      <w:r>
+        <w:rPr>
+          <w:lang w:val="en-GB"/>
+        </w:rPr>
+        <w:t>-UeParameters.cs</w:t>
+      </w:r>
+    </w:p>
+    <w:p>
+      <w:pPr>
+        <w:rPr>
+          <w:lang w:val="en-GB"/>
+        </w:rPr>
+      </w:pPr>
+      <w:r>
+        <w:rPr>
+          <w:lang w:val="en-GB"/>
+        </w:rPr>
+        <w:t>-KnifeEdgeObstacle.cs</w:t>
+      </w:r>
+    </w:p>
+    <w:p>
+      <w:pPr>
+        <w:rPr>
+          <w:lang w:val="en-GB"/>
+        </w:rPr>
+      </w:pPr>
+    </w:p>
+    <w:p>
+      <w:pPr>
+        <w:rPr>
+          <w:lang w:val="en-GB"/>
+        </w:rPr>
+      </w:pPr>
+      <w:r>
+        <w:rPr>
+          <w:lang w:val="en-GB"/>
+        </w:rPr>
+        <w:t>Questions:</w:t>
       </w:r>
     </w:p>
     <w:p>
@@ -254,30 +345,45 @@
         </w:rPr>
         <w:t>-</w:t>
       </w:r>
-      <w:r>
-        <w:rPr>
-          <w:lang w:val="en-GB"/>
-        </w:rPr>
-        <w:t xml:space="preserve"> </w:t>
-      </w:r>
-      <w:r>
-        <w:rPr>
-          <w:lang w:val="en-GB"/>
-        </w:rPr>
-        <w:t>change MCS in Unity</w:t>
-      </w:r>
-    </w:p>
-    <w:p>
-      <w:pPr>
-        <w:rPr>
-          <w:lang w:val="en-GB"/>
-        </w:rPr>
-      </w:pPr>
-      <w:r>
-        <w:rPr>
-          <w:lang w:val="en-GB"/>
-        </w:rPr>
-        <w:t>-change HARQ in Unity</w:t>
+    </w:p>
+    <w:p>
+      <w:pPr>
+        <w:rPr>
+          <w:lang w:val="en-GB"/>
+        </w:rPr>
+      </w:pPr>
+    </w:p>
+    <w:p>
+      <w:pPr>
+        <w:rPr>
+          <w:lang w:val="en-GB"/>
+        </w:rPr>
+      </w:pPr>
+    </w:p>
+    <w:p>
+      <w:pPr>
+        <w:rPr>
+          <w:lang w:val="en-GB"/>
+        </w:rPr>
+      </w:pPr>
+      <w:r>
+        <w:rPr>
+          <w:lang w:val="en-GB"/>
+        </w:rPr>
+        <w:t>Notes:</w:t>
+      </w:r>
+    </w:p>
+    <w:p>
+      <w:pPr>
+        <w:rPr>
+          <w:lang w:val="en-GB"/>
+        </w:rPr>
+      </w:pPr>
+      <w:r>
+        <w:rPr>
+          <w:lang w:val="en-GB"/>
+        </w:rPr>
+        <w:t>-5.4.2 Data transfer model</w:t>
       </w:r>
     </w:p>
     <w:p>
@@ -292,14 +398,12 @@
         </w:rPr>
         <w:t>-</w:t>
       </w:r>
-      <w:proofErr w:type="spellStart"/>
-      <w:r>
-        <w:rPr>
-          <w:lang w:val="en-GB"/>
-        </w:rPr>
-        <w:t>DataRecorder.cs</w:t>
-      </w:r>
-      <w:proofErr w:type="spellEnd"/>
+      <w:r>
+        <w:rPr>
+          <w:lang w:val="en-GB"/>
+        </w:rPr>
+        <w:t>5.4.3 Frame structure</w:t>
+      </w:r>
     </w:p>
     <w:p>
       <w:pPr>
@@ -317,7 +421,7 @@
         <w:rPr>
           <w:lang w:val="en-GB"/>
         </w:rPr>
-        <w:t>create new “UE” -&gt; FFD (+maybe RFD)</w:t>
+        <w:t>5.4.4.1 CSMA-CA mechanism</w:t>
       </w:r>
     </w:p>
     <w:p>
@@ -336,55 +440,25 @@
         <w:rPr>
           <w:lang w:val="en-GB"/>
         </w:rPr>
-        <w:t xml:space="preserve">change </w:t>
-      </w:r>
-      <w:proofErr w:type="spellStart"/>
-      <w:r>
-        <w:rPr>
-          <w:lang w:val="en-GB"/>
-        </w:rPr>
-        <w:t>filepaths</w:t>
-      </w:r>
-      <w:proofErr w:type="spellEnd"/>
-    </w:p>
-    <w:p>
-      <w:pPr>
-        <w:rPr>
-          <w:lang w:val="en-GB"/>
-        </w:rPr>
-      </w:pPr>
-      <w:r>
-        <w:rPr>
-          <w:lang w:val="en-GB"/>
-        </w:rPr>
-        <w:t>-how many retries?</w:t>
-      </w:r>
-    </w:p>
-    <w:p>
-      <w:pPr>
-        <w:rPr>
-          <w:lang w:val="en-GB"/>
-        </w:rPr>
-      </w:pPr>
-    </w:p>
-    <w:p>
-      <w:pPr>
-        <w:rPr>
-          <w:lang w:val="en-GB"/>
-        </w:rPr>
-      </w:pPr>
-    </w:p>
-    <w:p>
-      <w:pPr>
-        <w:rPr>
-          <w:lang w:val="en-GB"/>
-        </w:rPr>
-      </w:pPr>
-      <w:r>
-        <w:rPr>
-          <w:lang w:val="en-GB"/>
-        </w:rPr>
-        <w:t>Questions:</w:t>
+        <w:t>7.2.1.8 FCS field</w:t>
+      </w:r>
+      <w:r>
+        <w:rPr>
+          <w:lang w:val="en-GB"/>
+        </w:rPr>
+        <w:t xml:space="preserve"> (error detection</w:t>
+      </w:r>
+      <w:r>
+        <w:rPr>
+          <w:lang w:val="en-GB"/>
+        </w:rPr>
+        <w:t xml:space="preserve"> only</w:t>
+      </w:r>
+      <w:r>
+        <w:rPr>
+          <w:lang w:val="en-GB"/>
+        </w:rPr>
+        <w:t>)</w:t>
       </w:r>
     </w:p>
     <w:p>
@@ -399,45 +473,11 @@
         </w:rPr>
         <w:t>-</w:t>
       </w:r>
-    </w:p>
-    <w:p>
-      <w:pPr>
-        <w:rPr>
-          <w:lang w:val="en-GB"/>
-        </w:rPr>
-      </w:pPr>
-    </w:p>
-    <w:p>
-      <w:pPr>
-        <w:rPr>
-          <w:lang w:val="en-GB"/>
-        </w:rPr>
-      </w:pPr>
-    </w:p>
-    <w:p>
-      <w:pPr>
-        <w:rPr>
-          <w:lang w:val="en-GB"/>
-        </w:rPr>
-      </w:pPr>
-      <w:r>
-        <w:rPr>
-          <w:lang w:val="en-GB"/>
-        </w:rPr>
-        <w:t>Notes:</w:t>
-      </w:r>
-    </w:p>
-    <w:p>
-      <w:pPr>
-        <w:rPr>
-          <w:lang w:val="en-GB"/>
-        </w:rPr>
-      </w:pPr>
-      <w:r>
-        <w:rPr>
-          <w:lang w:val="en-GB"/>
-        </w:rPr>
-        <w:t>-5.4.2 Data transfer model</w:t>
+      <w:r>
+        <w:rPr>
+          <w:lang w:val="en-GB"/>
+        </w:rPr>
+        <w:t>7.5.6.4 Use of acknowledgments</w:t>
       </w:r>
     </w:p>
     <w:p>
@@ -456,7 +496,7 @@
         <w:rPr>
           <w:lang w:val="en-GB"/>
         </w:rPr>
-        <w:t>5.4.3 Frame structure</w:t>
+        <w:t>7.5.6.4.1 No acknowledgment</w:t>
       </w:r>
     </w:p>
     <w:p>
@@ -475,7 +515,46 @@
         <w:rPr>
           <w:lang w:val="en-GB"/>
         </w:rPr>
-        <w:t>5.4.4.1 CSMA-CA mechanism</w:t>
+        <w:t>Table 70—MAC sublayer constants</w:t>
+      </w:r>
+    </w:p>
+    <w:p>
+      <w:pPr>
+        <w:rPr>
+          <w:lang w:val="en-GB"/>
+        </w:rPr>
+      </w:pPr>
+      <w:r>
+        <w:rPr>
+          <w:lang w:val="en-GB"/>
+        </w:rPr>
+        <w:t>-max. transmission power S. 668 des Standards</w:t>
+      </w:r>
+    </w:p>
+    <w:p>
+      <w:pPr>
+        <w:rPr>
+          <w:lang w:val="en-GB"/>
+        </w:rPr>
+      </w:pPr>
+      <w:r>
+        <w:rPr>
+          <w:lang w:val="en-GB"/>
+        </w:rPr>
+        <w:t>-set rate of TXQueue with setRate() (device.lua)</w:t>
+      </w:r>
+    </w:p>
+    <w:p>
+      <w:pPr>
+        <w:rPr>
+          <w:lang w:val="en-GB"/>
+        </w:rPr>
+      </w:pPr>
+      <w:r>
+        <w:rPr>
+          <w:lang w:val="en-GB"/>
+        </w:rPr>
+        <w:t>-start with easier moongen script</w:t>
       </w:r>
     </w:p>
     <w:p>
@@ -490,190 +569,80 @@
         </w:rPr>
         <w:t>-</w:t>
       </w:r>
-      <w:r>
-        <w:rPr>
-          <w:lang w:val="en-GB"/>
-        </w:rPr>
-        <w:t>7.2.1.8 FCS field</w:t>
-      </w:r>
-      <w:r>
-        <w:rPr>
-          <w:lang w:val="en-GB"/>
-        </w:rPr>
-        <w:t xml:space="preserve"> (error detection</w:t>
-      </w:r>
-      <w:r>
-        <w:rPr>
-          <w:lang w:val="en-GB"/>
-        </w:rPr>
-        <w:t xml:space="preserve"> only</w:t>
-      </w:r>
-      <w:r>
-        <w:rPr>
-          <w:lang w:val="en-GB"/>
-        </w:rPr>
-        <w:t>)</w:t>
-      </w:r>
-    </w:p>
-    <w:p>
-      <w:pPr>
-        <w:rPr>
-          <w:lang w:val="en-GB"/>
-        </w:rPr>
-      </w:pPr>
-      <w:r>
-        <w:rPr>
-          <w:lang w:val="en-GB"/>
-        </w:rPr>
-        <w:t>-</w:t>
-      </w:r>
-      <w:r>
-        <w:rPr>
-          <w:lang w:val="en-GB"/>
-        </w:rPr>
-        <w:t>7.5.6.4 Use of acknowledgments</w:t>
-      </w:r>
-    </w:p>
-    <w:p>
-      <w:pPr>
-        <w:rPr>
-          <w:lang w:val="en-GB"/>
-        </w:rPr>
-      </w:pPr>
-      <w:r>
-        <w:rPr>
-          <w:lang w:val="en-GB"/>
-        </w:rPr>
-        <w:t>-</w:t>
-      </w:r>
-      <w:r>
-        <w:rPr>
-          <w:lang w:val="en-GB"/>
-        </w:rPr>
-        <w:t>7.5.6.4.1 No acknowledgment</w:t>
-      </w:r>
-    </w:p>
-    <w:p>
-      <w:pPr>
-        <w:rPr>
-          <w:lang w:val="en-GB"/>
-        </w:rPr>
-      </w:pPr>
-      <w:r>
-        <w:rPr>
-          <w:lang w:val="en-GB"/>
-        </w:rPr>
-        <w:t>-max. transmission power S. 668 des Standards</w:t>
-      </w:r>
-    </w:p>
-    <w:p>
-      <w:pPr>
-        <w:rPr>
-          <w:lang w:val="en-GB"/>
-        </w:rPr>
-      </w:pPr>
-      <w:r>
-        <w:rPr>
-          <w:lang w:val="en-GB"/>
-        </w:rPr>
-        <w:t xml:space="preserve">-set rate of </w:t>
-      </w:r>
-      <w:proofErr w:type="spellStart"/>
-      <w:r>
-        <w:rPr>
-          <w:lang w:val="en-GB"/>
-        </w:rPr>
-        <w:t>TXQueue</w:t>
-      </w:r>
-      <w:proofErr w:type="spellEnd"/>
-      <w:r>
-        <w:rPr>
-          <w:lang w:val="en-GB"/>
-        </w:rPr>
-        <w:t xml:space="preserve"> with </w:t>
-      </w:r>
-      <w:proofErr w:type="spellStart"/>
-      <w:r>
-        <w:rPr>
-          <w:lang w:val="en-GB"/>
-        </w:rPr>
-        <w:t>setRate</w:t>
-      </w:r>
-      <w:proofErr w:type="spellEnd"/>
-      <w:r>
-        <w:rPr>
-          <w:lang w:val="en-GB"/>
-        </w:rPr>
-        <w:t>() (</w:t>
-      </w:r>
-      <w:proofErr w:type="spellStart"/>
-      <w:r>
-        <w:rPr>
-          <w:lang w:val="en-GB"/>
-        </w:rPr>
-        <w:t>device.lua</w:t>
-      </w:r>
-      <w:proofErr w:type="spellEnd"/>
-      <w:r>
-        <w:rPr>
-          <w:lang w:val="en-GB"/>
-        </w:rPr>
-        <w:t>)</w:t>
-      </w:r>
-    </w:p>
-    <w:p>
-      <w:pPr>
-        <w:rPr>
-          <w:lang w:val="en-GB"/>
-        </w:rPr>
-      </w:pPr>
-      <w:r>
-        <w:rPr>
-          <w:lang w:val="en-GB"/>
-        </w:rPr>
-        <w:t xml:space="preserve">-start with easier </w:t>
-      </w:r>
-      <w:proofErr w:type="spellStart"/>
-      <w:r>
-        <w:rPr>
-          <w:lang w:val="en-GB"/>
-        </w:rPr>
-        <w:t>moongen</w:t>
-      </w:r>
-      <w:proofErr w:type="spellEnd"/>
-      <w:r>
-        <w:rPr>
-          <w:lang w:val="en-GB"/>
-        </w:rPr>
-        <w:t xml:space="preserve"> script</w:t>
-      </w:r>
-    </w:p>
-    <w:p>
-      <w:r>
-        <w:t>-</w:t>
-      </w:r>
-    </w:p>
-    <w:p/>
-    <w:p/>
-    <w:p/>
-    <w:p/>
-    <w:p/>
-    <w:p/>
-    <w:p/>
-    <w:p/>
-    <w:p/>
-    <w:p/>
-    <w:p>
-      <w:r>
-        <w:t xml:space="preserve">-Ergebnisse am Ende mit NS-3 und </w:t>
-      </w:r>
-      <w:proofErr w:type="spellStart"/>
-      <w:r>
-        <w:t>Omnet</w:t>
-      </w:r>
-      <w:proofErr w:type="spellEnd"/>
-      <w:r>
-        <w:t>++ vergleichen</w:t>
+    </w:p>
+    <w:p>
+      <w:pPr>
+        <w:rPr>
+          <w:lang w:val="en-GB"/>
+        </w:rPr>
+      </w:pPr>
+    </w:p>
+    <w:p>
+      <w:pPr>
+        <w:rPr>
+          <w:lang w:val="en-GB"/>
+        </w:rPr>
+      </w:pPr>
+    </w:p>
+    <w:p>
+      <w:pPr>
+        <w:rPr>
+          <w:lang w:val="en-GB"/>
+        </w:rPr>
+      </w:pPr>
+    </w:p>
+    <w:p>
+      <w:pPr>
+        <w:rPr>
+          <w:lang w:val="en-GB"/>
+        </w:rPr>
+      </w:pPr>
+    </w:p>
+    <w:p>
+      <w:pPr>
+        <w:rPr>
+          <w:lang w:val="en-GB"/>
+        </w:rPr>
+      </w:pPr>
+    </w:p>
+    <w:p>
+      <w:pPr>
+        <w:rPr>
+          <w:lang w:val="en-GB"/>
+        </w:rPr>
+      </w:pPr>
+    </w:p>
+    <w:p>
+      <w:pPr>
+        <w:rPr>
+          <w:lang w:val="en-GB"/>
+        </w:rPr>
+      </w:pPr>
+    </w:p>
+    <w:p>
+      <w:pPr>
+        <w:rPr>
+          <w:lang w:val="en-GB"/>
+        </w:rPr>
+      </w:pPr>
+    </w:p>
+    <w:p>
+      <w:pPr>
+        <w:rPr>
+          <w:lang w:val="en-GB"/>
+        </w:rPr>
+      </w:pPr>
+    </w:p>
+    <w:p>
+      <w:pPr>
+        <w:rPr>
+          <w:lang w:val="en-GB"/>
+        </w:rPr>
+      </w:pPr>
+    </w:p>
+    <w:p>
+      <w:r>
+        <w:t>-Ergebnisse am Ende mit NS-3 und Omnet++ vergleichen</w:t>
       </w:r>
     </w:p>
     <w:p/>
@@ -751,7 +720,7 @@
                     <pic:cNvPicPr/>
                   </pic:nvPicPr>
                   <pic:blipFill>
-                    <a:blip r:embed="rId4"/>
+                    <a:blip r:embed="rId5"/>
                     <a:stretch>
                       <a:fillRect/>
                     </a:stretch>
@@ -2103,4 +2072,16 @@
     </a:ext>
   </a:extLst>
 </a:theme>
+</file>
+
+<file path=customXml/item1.xml><?xml version="1.0" encoding="utf-8"?>
+<b:Sources xmlns:b="http://schemas.openxmlformats.org/officeDocument/2006/bibliography" xmlns="http://schemas.openxmlformats.org/officeDocument/2006/bibliography" SelectedStyle="\APASixthEditionOfficeOnline.xsl" StyleName="APA" Version="6"/>
+</file>
+
+<file path=customXml/itemProps1.xml><?xml version="1.0" encoding="utf-8"?>
+<ds:datastoreItem xmlns:ds="http://schemas.openxmlformats.org/officeDocument/2006/customXml" ds:itemID="{9917165A-54C5-47C7-ABB4-A214C69AC3FA}">
+  <ds:schemaRefs>
+    <ds:schemaRef ds:uri="http://schemas.openxmlformats.org/officeDocument/2006/bibliography"/>
+  </ds:schemaRefs>
+</ds:datastoreItem>
 </file>
</xml_diff>

<commit_message>
Reverting Changes and looking at code
</commit_message>
<xml_diff>
--- a/Notes.docx
+++ b/Notes.docx
@@ -150,21 +150,70 @@
         <w:rPr>
           <w:lang w:val="en-GB"/>
         </w:rPr>
+        <w:t>-moongen forward</w:t>
+      </w:r>
+    </w:p>
+    <w:p>
+      <w:pPr>
+        <w:rPr>
+          <w:lang w:val="en-GB"/>
+        </w:rPr>
+      </w:pPr>
+      <w:r>
+        <w:rPr>
+          <w:lang w:val="en-GB"/>
+        </w:rPr>
+        <w:t>-moongen receive</w:t>
+      </w:r>
+    </w:p>
+    <w:p>
+      <w:pPr>
+        <w:rPr>
+          <w:lang w:val="en-GB"/>
+        </w:rPr>
+      </w:pPr>
+      <w:r>
+        <w:rPr>
+          <w:lang w:val="en-GB"/>
+        </w:rPr>
+        <w:t>-DataRecorder.cs</w:t>
+      </w:r>
+      <w:r>
+        <w:rPr>
+          <w:lang w:val="en-GB"/>
+        </w:rPr>
+        <w:t xml:space="preserve"> //BER+SNR</w:t>
+      </w:r>
+      <w:r>
+        <w:rPr>
+          <w:lang w:val="en-GB"/>
+        </w:rPr>
+        <w:t>?</w:t>
+      </w:r>
+    </w:p>
+    <w:p>
+      <w:pPr>
+        <w:rPr>
+          <w:lang w:val="en-GB"/>
+        </w:rPr>
+      </w:pPr>
+      <w:r>
+        <w:rPr>
+          <w:lang w:val="en-GB"/>
+        </w:rPr>
         <w:t>-</w:t>
       </w:r>
-      <w:proofErr w:type="spellStart"/>
-      <w:r>
-        <w:rPr>
-          <w:lang w:val="en-GB"/>
-        </w:rPr>
-        <w:t>moongen</w:t>
-      </w:r>
-      <w:proofErr w:type="spellEnd"/>
-      <w:r>
-        <w:rPr>
-          <w:lang w:val="en-GB"/>
-        </w:rPr>
-        <w:t xml:space="preserve"> forward</w:t>
+      <w:r>
+        <w:rPr>
+          <w:lang w:val="en-GB"/>
+        </w:rPr>
+        <w:t>create new “UE” -&gt; FFD (+maybe RFD)</w:t>
+      </w:r>
+      <w:r>
+        <w:rPr>
+          <w:lang w:val="en-GB"/>
+        </w:rPr>
+        <w:t>?</w:t>
       </w:r>
     </w:p>
     <w:p>
@@ -179,19 +228,146 @@
         </w:rPr>
         <w:t>-</w:t>
       </w:r>
-      <w:proofErr w:type="spellStart"/>
-      <w:r>
-        <w:rPr>
-          <w:lang w:val="en-GB"/>
-        </w:rPr>
-        <w:t>moongen</w:t>
-      </w:r>
-      <w:proofErr w:type="spellEnd"/>
-      <w:r>
-        <w:rPr>
-          <w:lang w:val="en-GB"/>
-        </w:rPr>
-        <w:t xml:space="preserve"> receive</w:t>
+      <w:r>
+        <w:rPr>
+          <w:lang w:val="en-GB"/>
+        </w:rPr>
+        <w:t>change filepaths</w:t>
+      </w:r>
+    </w:p>
+    <w:p>
+      <w:pPr>
+        <w:rPr>
+          <w:lang w:val="en-GB"/>
+        </w:rPr>
+      </w:pPr>
+      <w:r>
+        <w:rPr>
+          <w:lang w:val="en-GB"/>
+        </w:rPr>
+        <w:t>-SCPFile.cs</w:t>
+      </w:r>
+    </w:p>
+    <w:p>
+      <w:pPr>
+        <w:rPr>
+          <w:lang w:val="en-GB"/>
+        </w:rPr>
+      </w:pPr>
+      <w:r>
+        <w:rPr>
+          <w:lang w:val="en-GB"/>
+        </w:rPr>
+        <w:t>-PSCPReceiveFile.cs</w:t>
+      </w:r>
+    </w:p>
+    <w:p>
+      <w:pPr>
+        <w:rPr>
+          <w:lang w:val="en-GB"/>
+        </w:rPr>
+      </w:pPr>
+      <w:r>
+        <w:rPr>
+          <w:lang w:val="en-GB"/>
+        </w:rPr>
+        <w:t>-PSCPSendFile.cs, Filepaths etc</w:t>
+      </w:r>
+    </w:p>
+    <w:p>
+      <w:pPr>
+        <w:rPr>
+          <w:lang w:val="en-GB"/>
+        </w:rPr>
+      </w:pPr>
+      <w:r>
+        <w:rPr>
+          <w:lang w:val="en-GB"/>
+        </w:rPr>
+        <w:t>-TxPower.cs</w:t>
+      </w:r>
+    </w:p>
+    <w:p>
+      <w:pPr>
+        <w:rPr>
+          <w:lang w:val="en-GB"/>
+        </w:rPr>
+      </w:pPr>
+      <w:r>
+        <w:rPr>
+          <w:lang w:val="en-GB"/>
+        </w:rPr>
+        <w:t>-UeParameters.cs</w:t>
+      </w:r>
+      <w:r>
+        <w:rPr>
+          <w:lang w:val="en-GB"/>
+        </w:rPr>
+        <w:t xml:space="preserve"> (device properties)</w:t>
+      </w:r>
+    </w:p>
+    <w:p>
+      <w:pPr>
+        <w:rPr>
+          <w:lang w:val="en-GB"/>
+        </w:rPr>
+      </w:pPr>
+      <w:r>
+        <w:rPr>
+          <w:lang w:val="en-GB"/>
+        </w:rPr>
+        <w:t>-Throughput in moongen</w:t>
+      </w:r>
+      <w:r>
+        <w:rPr>
+          <w:lang w:val="en-GB"/>
+        </w:rPr>
+        <w:t>?</w:t>
+      </w:r>
+    </w:p>
+    <w:p>
+      <w:pPr>
+        <w:rPr>
+          <w:lang w:val="en-GB"/>
+        </w:rPr>
+      </w:pPr>
+      <w:r>
+        <w:rPr>
+          <w:lang w:val="en-GB"/>
+        </w:rPr>
+        <w:t>-get BER Value to moongen</w:t>
+      </w:r>
+    </w:p>
+    <w:p>
+      <w:pPr>
+        <w:rPr>
+          <w:lang w:val="en-GB"/>
+        </w:rPr>
+      </w:pPr>
+      <w:r>
+        <w:rPr>
+          <w:lang w:val="en-GB"/>
+        </w:rPr>
+        <w:t>-delete further</w:t>
+      </w:r>
+    </w:p>
+    <w:p>
+      <w:pPr>
+        <w:rPr>
+          <w:lang w:val="en-GB"/>
+        </w:rPr>
+      </w:pPr>
+      <w:r>
+        <w:rPr>
+          <w:lang w:val="en-GB"/>
+        </w:rPr>
+        <w:t>-show BER and Throughput in Data</w:t>
+      </w:r>
+      <w:r>
+        <w:rPr>
+          <w:lang w:val="en-GB"/>
+        </w:rPr>
+        <w:t>Display.cs</w:t>
       </w:r>
     </w:p>
     <w:p>
@@ -206,50 +382,142 @@
         </w:rPr>
         <w:t>-</w:t>
       </w:r>
-      <w:proofErr w:type="spellStart"/>
-      <w:r>
-        <w:rPr>
-          <w:lang w:val="en-GB"/>
-        </w:rPr>
-        <w:t>DataRecorder.cs</w:t>
-      </w:r>
-      <w:proofErr w:type="spellEnd"/>
-      <w:r>
-        <w:rPr>
-          <w:lang w:val="en-GB"/>
-        </w:rPr>
-        <w:t xml:space="preserve"> //BER+SNR</w:t>
-      </w:r>
-      <w:r>
-        <w:rPr>
-          <w:lang w:val="en-GB"/>
-        </w:rPr>
-        <w:t>?</w:t>
-      </w:r>
-    </w:p>
-    <w:p>
-      <w:pPr>
-        <w:rPr>
-          <w:lang w:val="en-GB"/>
-        </w:rPr>
-      </w:pPr>
-      <w:r>
-        <w:rPr>
-          <w:lang w:val="en-GB"/>
-        </w:rPr>
+      <w:r>
+        <w:rPr>
+          <w:lang w:val="en-GB"/>
+        </w:rPr>
+        <w:t>get Connection to emulab to work</w:t>
+      </w:r>
+    </w:p>
+    <w:p>
+      <w:pPr>
+        <w:rPr>
+          <w:lang w:val="en-GB"/>
+        </w:rPr>
+      </w:pPr>
+      <w:r>
+        <w:rPr>
+          <w:lang w:val="en-GB"/>
+        </w:rPr>
+        <w:t>-create scene for test</w:t>
+      </w:r>
+    </w:p>
+    <w:p>
+      <w:pPr>
+        <w:rPr>
+          <w:lang w:val="en-GB"/>
+        </w:rPr>
+      </w:pPr>
+      <w:r>
+        <w:rPr>
+          <w:lang w:val="en-GB"/>
+        </w:rPr>
+        <w:t>-look at BER while moving UE/FFD</w:t>
+      </w:r>
+    </w:p>
+    <w:p>
+      <w:pPr>
+        <w:rPr>
+          <w:lang w:val="en-GB"/>
+        </w:rPr>
+      </w:pPr>
+    </w:p>
+    <w:p>
+      <w:pPr>
+        <w:rPr>
+          <w:lang w:val="en-GB"/>
+        </w:rPr>
+      </w:pPr>
+      <w:r>
+        <w:rPr>
+          <w:lang w:val="en-GB"/>
+        </w:rPr>
+        <w:t>Advanced:</w:t>
+      </w:r>
+    </w:p>
+    <w:p>
+      <w:pPr>
+        <w:rPr>
+          <w:lang w:val="en-GB"/>
+        </w:rPr>
+      </w:pPr>
+      <w:r>
+        <w:rPr>
+          <w:lang w:val="en-GB"/>
+        </w:rPr>
+        <w:t>-Beacon mode</w:t>
+      </w:r>
+    </w:p>
+    <w:p>
+      <w:pPr>
+        <w:rPr>
+          <w:lang w:val="en-GB"/>
+        </w:rPr>
+      </w:pPr>
+    </w:p>
+    <w:p>
+      <w:pPr>
+        <w:rPr>
+          <w:lang w:val="en-GB"/>
+        </w:rPr>
+      </w:pPr>
+    </w:p>
+    <w:p>
+      <w:pPr>
+        <w:rPr>
+          <w:lang w:val="en-GB"/>
+        </w:rPr>
+      </w:pPr>
+      <w:r>
+        <w:rPr>
+          <w:lang w:val="en-GB"/>
+        </w:rPr>
+        <w:t>Questions:</w:t>
+      </w:r>
+    </w:p>
+    <w:p>
+      <w:r>
         <w:t>-</w:t>
       </w:r>
       <w:r>
-        <w:rPr>
-          <w:lang w:val="en-GB"/>
-        </w:rPr>
-        <w:t>create new “UE” -&gt; FFD (+maybe RFD)</w:t>
-      </w:r>
-      <w:r>
-        <w:rPr>
-          <w:lang w:val="en-GB"/>
-        </w:rPr>
-        <w:t>?</w:t>
+        <w:t xml:space="preserve">was muss ich </w:t>
+      </w:r>
+      <w:r>
+        <w:t>wo</w:t>
+      </w:r>
+      <w:r>
+        <w:t xml:space="preserve"> i</w:t>
+      </w:r>
+      <w:r>
+        <w:t>nstallieren damit es läuft? (PCAP, socket.lua, …)</w:t>
+      </w:r>
+    </w:p>
+    <w:p/>
+    <w:p/>
+    <w:p>
+      <w:pPr>
+        <w:rPr>
+          <w:lang w:val="en-GB"/>
+        </w:rPr>
+      </w:pPr>
+      <w:r>
+        <w:rPr>
+          <w:lang w:val="en-GB"/>
+        </w:rPr>
+        <w:t>Notes:</w:t>
+      </w:r>
+    </w:p>
+    <w:p>
+      <w:pPr>
+        <w:rPr>
+          <w:lang w:val="en-GB"/>
+        </w:rPr>
+      </w:pPr>
+      <w:r>
+        <w:rPr>
+          <w:lang w:val="en-GB"/>
+        </w:rPr>
+        <w:t>-5.4.2 Data transfer model</w:t>
       </w:r>
     </w:p>
     <w:p>
@@ -268,16 +536,8 @@
         <w:rPr>
           <w:lang w:val="en-GB"/>
         </w:rPr>
-        <w:t xml:space="preserve">change </w:t>
-      </w:r>
-      <w:proofErr w:type="spellStart"/>
-      <w:r>
-        <w:rPr>
-          <w:lang w:val="en-GB"/>
-        </w:rPr>
-        <w:t>filepaths</w:t>
-      </w:r>
-      <w:proofErr w:type="spellEnd"/>
+        <w:t>5.4.3 Frame structure</w:t>
+      </w:r>
     </w:p>
     <w:p>
       <w:pPr>
@@ -291,14 +551,12 @@
         </w:rPr>
         <w:t>-</w:t>
       </w:r>
-      <w:proofErr w:type="spellStart"/>
-      <w:r>
-        <w:rPr>
-          <w:lang w:val="en-GB"/>
-        </w:rPr>
-        <w:t>TxPower.cs</w:t>
-      </w:r>
-      <w:proofErr w:type="spellEnd"/>
+      <w:r>
+        <w:rPr>
+          <w:lang w:val="en-GB"/>
+        </w:rPr>
+        <w:t>5.4.4.1 CSMA-CA mechanism</w:t>
+      </w:r>
     </w:p>
     <w:p>
       <w:pPr>
@@ -312,108 +570,30 @@
         </w:rPr>
         <w:t>-</w:t>
       </w:r>
-      <w:proofErr w:type="spellStart"/>
-      <w:r>
-        <w:rPr>
-          <w:lang w:val="en-GB"/>
-        </w:rPr>
-        <w:t>UeParameters.cs</w:t>
-      </w:r>
-      <w:proofErr w:type="spellEnd"/>
-      <w:r>
-        <w:rPr>
-          <w:lang w:val="en-GB"/>
-        </w:rPr>
-        <w:t xml:space="preserve"> (device properties)</w:t>
-      </w:r>
-    </w:p>
-    <w:p>
-      <w:pPr>
-        <w:rPr>
-          <w:lang w:val="en-GB"/>
-        </w:rPr>
-      </w:pPr>
-      <w:r>
-        <w:rPr>
-          <w:lang w:val="en-GB"/>
-        </w:rPr>
-        <w:t xml:space="preserve">-Throughput in </w:t>
-      </w:r>
-      <w:proofErr w:type="spellStart"/>
-      <w:r>
-        <w:rPr>
-          <w:lang w:val="en-GB"/>
-        </w:rPr>
-        <w:t>moongen</w:t>
-      </w:r>
-      <w:proofErr w:type="spellEnd"/>
-      <w:r>
-        <w:rPr>
-          <w:lang w:val="en-GB"/>
-        </w:rPr>
-        <w:t>?</w:t>
-      </w:r>
-    </w:p>
-    <w:p>
-      <w:pPr>
-        <w:rPr>
-          <w:lang w:val="en-GB"/>
-        </w:rPr>
-      </w:pPr>
-      <w:r>
-        <w:rPr>
-          <w:lang w:val="en-GB"/>
-        </w:rPr>
-        <w:t xml:space="preserve">-get BER Value to </w:t>
-      </w:r>
-      <w:proofErr w:type="spellStart"/>
-      <w:r>
-        <w:rPr>
-          <w:lang w:val="en-GB"/>
-        </w:rPr>
-        <w:t>moongen</w:t>
-      </w:r>
-      <w:proofErr w:type="spellEnd"/>
-    </w:p>
-    <w:p>
-      <w:pPr>
-        <w:rPr>
-          <w:lang w:val="en-GB"/>
-        </w:rPr>
-      </w:pPr>
-      <w:r>
-        <w:rPr>
-          <w:lang w:val="en-GB"/>
-        </w:rPr>
-        <w:t>-delete further</w:t>
-      </w:r>
-    </w:p>
-    <w:p>
-      <w:pPr>
-        <w:rPr>
-          <w:lang w:val="en-GB"/>
-        </w:rPr>
-      </w:pPr>
-      <w:r>
-        <w:rPr>
-          <w:lang w:val="en-GB"/>
-        </w:rPr>
-        <w:t xml:space="preserve">-show BER and Throughput in </w:t>
-      </w:r>
-      <w:proofErr w:type="spellStart"/>
-      <w:r>
-        <w:rPr>
-          <w:lang w:val="en-GB"/>
-        </w:rPr>
-        <w:t>Data</w:t>
-      </w:r>
-      <w:r>
-        <w:rPr>
-          <w:lang w:val="en-GB"/>
-        </w:rPr>
-        <w:t>Display.cs</w:t>
-      </w:r>
-      <w:proofErr w:type="spellEnd"/>
+      <w:r>
+        <w:rPr>
+          <w:lang w:val="en-GB"/>
+        </w:rPr>
+        <w:t>7.2.1.8 FCS field</w:t>
+      </w:r>
+      <w:r>
+        <w:rPr>
+          <w:lang w:val="en-GB"/>
+        </w:rPr>
+        <w:t xml:space="preserve"> (error detection</w:t>
+      </w:r>
+      <w:r>
+        <w:rPr>
+          <w:lang w:val="en-GB"/>
+        </w:rPr>
+        <w:t xml:space="preserve"> only</w:t>
+      </w:r>
+      <w:r>
+        <w:rPr>
+          <w:lang w:val="en-GB"/>
+        </w:rPr>
+        <w:t>)</w:t>
+      </w:r>
     </w:p>
     <w:p>
       <w:pPr>
@@ -431,107 +611,7 @@
         <w:rPr>
           <w:lang w:val="en-GB"/>
         </w:rPr>
-        <w:t xml:space="preserve">get Connection to </w:t>
-      </w:r>
-      <w:proofErr w:type="spellStart"/>
-      <w:r>
-        <w:rPr>
-          <w:lang w:val="en-GB"/>
-        </w:rPr>
-        <w:t>emulab</w:t>
-      </w:r>
-      <w:proofErr w:type="spellEnd"/>
-      <w:r>
-        <w:rPr>
-          <w:lang w:val="en-GB"/>
-        </w:rPr>
-        <w:t xml:space="preserve"> to work</w:t>
-      </w:r>
-    </w:p>
-    <w:p>
-      <w:pPr>
-        <w:rPr>
-          <w:lang w:val="en-GB"/>
-        </w:rPr>
-      </w:pPr>
-      <w:r>
-        <w:rPr>
-          <w:lang w:val="en-GB"/>
-        </w:rPr>
-        <w:t>-create scene for test</w:t>
-      </w:r>
-    </w:p>
-    <w:p>
-      <w:pPr>
-        <w:rPr>
-          <w:lang w:val="en-GB"/>
-        </w:rPr>
-      </w:pPr>
-      <w:r>
-        <w:rPr>
-          <w:lang w:val="en-GB"/>
-        </w:rPr>
-        <w:t>-look at BER while moving UE/FFD</w:t>
-      </w:r>
-    </w:p>
-    <w:p>
-      <w:pPr>
-        <w:rPr>
-          <w:lang w:val="en-GB"/>
-        </w:rPr>
-      </w:pPr>
-    </w:p>
-    <w:p>
-      <w:pPr>
-        <w:rPr>
-          <w:lang w:val="en-GB"/>
-        </w:rPr>
-      </w:pPr>
-      <w:r>
-        <w:rPr>
-          <w:lang w:val="en-GB"/>
-        </w:rPr>
-        <w:t>Advanced:</w:t>
-      </w:r>
-    </w:p>
-    <w:p>
-      <w:pPr>
-        <w:rPr>
-          <w:lang w:val="en-GB"/>
-        </w:rPr>
-      </w:pPr>
-      <w:r>
-        <w:rPr>
-          <w:lang w:val="en-GB"/>
-        </w:rPr>
-        <w:t>-Beacon mode</w:t>
-      </w:r>
-    </w:p>
-    <w:p>
-      <w:pPr>
-        <w:rPr>
-          <w:lang w:val="en-GB"/>
-        </w:rPr>
-      </w:pPr>
-    </w:p>
-    <w:p>
-      <w:pPr>
-        <w:rPr>
-          <w:lang w:val="en-GB"/>
-        </w:rPr>
-      </w:pPr>
-    </w:p>
-    <w:p>
-      <w:pPr>
-        <w:rPr>
-          <w:lang w:val="en-GB"/>
-        </w:rPr>
-      </w:pPr>
-      <w:r>
-        <w:rPr>
-          <w:lang w:val="en-GB"/>
-        </w:rPr>
-        <w:t>Questions:</w:t>
+        <w:t>7.5.6.4 Use of acknowledgments</w:t>
       </w:r>
     </w:p>
     <w:p>
@@ -546,45 +626,11 @@
         </w:rPr>
         <w:t>-</w:t>
       </w:r>
-    </w:p>
-    <w:p>
-      <w:pPr>
-        <w:rPr>
-          <w:lang w:val="en-GB"/>
-        </w:rPr>
-      </w:pPr>
-    </w:p>
-    <w:p>
-      <w:pPr>
-        <w:rPr>
-          <w:lang w:val="en-GB"/>
-        </w:rPr>
-      </w:pPr>
-    </w:p>
-    <w:p>
-      <w:pPr>
-        <w:rPr>
-          <w:lang w:val="en-GB"/>
-        </w:rPr>
-      </w:pPr>
-      <w:r>
-        <w:rPr>
-          <w:lang w:val="en-GB"/>
-        </w:rPr>
-        <w:t>Notes:</w:t>
-      </w:r>
-    </w:p>
-    <w:p>
-      <w:pPr>
-        <w:rPr>
-          <w:lang w:val="en-GB"/>
-        </w:rPr>
-      </w:pPr>
-      <w:r>
-        <w:rPr>
-          <w:lang w:val="en-GB"/>
-        </w:rPr>
-        <w:t>-5.4.2 Data transfer model</w:t>
+      <w:r>
+        <w:rPr>
+          <w:lang w:val="en-GB"/>
+        </w:rPr>
+        <w:t>7.5.6.4.1 No acknowledgment</w:t>
       </w:r>
     </w:p>
     <w:p>
@@ -603,7 +649,46 @@
         <w:rPr>
           <w:lang w:val="en-GB"/>
         </w:rPr>
-        <w:t>5.4.3 Frame structure</w:t>
+        <w:t>Table 70—MAC sublayer constants</w:t>
+      </w:r>
+    </w:p>
+    <w:p>
+      <w:pPr>
+        <w:rPr>
+          <w:lang w:val="en-GB"/>
+        </w:rPr>
+      </w:pPr>
+      <w:r>
+        <w:rPr>
+          <w:lang w:val="en-GB"/>
+        </w:rPr>
+        <w:t>-max. transmission power S. 668 des Standards</w:t>
+      </w:r>
+    </w:p>
+    <w:p>
+      <w:pPr>
+        <w:rPr>
+          <w:lang w:val="en-GB"/>
+        </w:rPr>
+      </w:pPr>
+      <w:r>
+        <w:rPr>
+          <w:lang w:val="en-GB"/>
+        </w:rPr>
+        <w:t>-set rate of TXQueue with setRate() (device.lua)</w:t>
+      </w:r>
+    </w:p>
+    <w:p>
+      <w:pPr>
+        <w:rPr>
+          <w:lang w:val="en-GB"/>
+        </w:rPr>
+      </w:pPr>
+      <w:r>
+        <w:rPr>
+          <w:lang w:val="en-GB"/>
+        </w:rPr>
+        <w:t>-start with easier moongen script</w:t>
       </w:r>
     </w:p>
     <w:p>
@@ -618,304 +703,80 @@
         </w:rPr>
         <w:t>-</w:t>
       </w:r>
-      <w:r>
-        <w:rPr>
-          <w:lang w:val="en-GB"/>
-        </w:rPr>
-        <w:t>5.4.4.1 CSMA-CA mechanism</w:t>
-      </w:r>
-    </w:p>
-    <w:p>
-      <w:pPr>
-        <w:rPr>
-          <w:lang w:val="en-GB"/>
-        </w:rPr>
-      </w:pPr>
-      <w:r>
-        <w:rPr>
-          <w:lang w:val="en-GB"/>
-        </w:rPr>
-        <w:t>-</w:t>
-      </w:r>
-      <w:r>
-        <w:rPr>
-          <w:lang w:val="en-GB"/>
-        </w:rPr>
-        <w:t>7.2.1.8 FCS field</w:t>
-      </w:r>
-      <w:r>
-        <w:rPr>
-          <w:lang w:val="en-GB"/>
-        </w:rPr>
-        <w:t xml:space="preserve"> (error detection</w:t>
-      </w:r>
-      <w:r>
-        <w:rPr>
-          <w:lang w:val="en-GB"/>
-        </w:rPr>
-        <w:t xml:space="preserve"> only</w:t>
-      </w:r>
-      <w:r>
-        <w:rPr>
-          <w:lang w:val="en-GB"/>
-        </w:rPr>
-        <w:t>)</w:t>
-      </w:r>
-    </w:p>
-    <w:p>
-      <w:pPr>
-        <w:rPr>
-          <w:lang w:val="en-GB"/>
-        </w:rPr>
-      </w:pPr>
-      <w:r>
-        <w:rPr>
-          <w:lang w:val="en-GB"/>
-        </w:rPr>
-        <w:t>-</w:t>
-      </w:r>
-      <w:r>
-        <w:rPr>
-          <w:lang w:val="en-GB"/>
-        </w:rPr>
-        <w:t>7.5.6.4 Use of acknowledgments</w:t>
-      </w:r>
-    </w:p>
-    <w:p>
-      <w:pPr>
-        <w:rPr>
-          <w:lang w:val="en-GB"/>
-        </w:rPr>
-      </w:pPr>
-      <w:r>
-        <w:rPr>
-          <w:lang w:val="en-GB"/>
-        </w:rPr>
-        <w:t>-</w:t>
-      </w:r>
-      <w:r>
-        <w:rPr>
-          <w:lang w:val="en-GB"/>
-        </w:rPr>
-        <w:t>7.5.6.4.1 No acknowledgment</w:t>
-      </w:r>
-    </w:p>
-    <w:p>
-      <w:pPr>
-        <w:rPr>
-          <w:lang w:val="en-GB"/>
-        </w:rPr>
-      </w:pPr>
-      <w:r>
-        <w:rPr>
-          <w:lang w:val="en-GB"/>
-        </w:rPr>
-        <w:t>-</w:t>
-      </w:r>
-      <w:r>
-        <w:rPr>
-          <w:lang w:val="en-GB"/>
-        </w:rPr>
-        <w:t>Table 70—MAC sublayer constants</w:t>
-      </w:r>
-    </w:p>
-    <w:p>
-      <w:pPr>
-        <w:rPr>
-          <w:lang w:val="en-GB"/>
-        </w:rPr>
-      </w:pPr>
-      <w:r>
-        <w:rPr>
-          <w:lang w:val="en-GB"/>
-        </w:rPr>
-        <w:t>-max. transmission power S. 668 des Standards</w:t>
-      </w:r>
-    </w:p>
-    <w:p>
-      <w:pPr>
-        <w:rPr>
-          <w:lang w:val="en-GB"/>
-        </w:rPr>
-      </w:pPr>
-      <w:r>
-        <w:rPr>
-          <w:lang w:val="en-GB"/>
-        </w:rPr>
-        <w:t xml:space="preserve">-set rate of </w:t>
-      </w:r>
-      <w:proofErr w:type="spellStart"/>
-      <w:r>
-        <w:rPr>
-          <w:lang w:val="en-GB"/>
-        </w:rPr>
-        <w:t>TXQueue</w:t>
-      </w:r>
-      <w:proofErr w:type="spellEnd"/>
-      <w:r>
-        <w:rPr>
-          <w:lang w:val="en-GB"/>
-        </w:rPr>
-        <w:t xml:space="preserve"> with </w:t>
-      </w:r>
-      <w:proofErr w:type="spellStart"/>
-      <w:proofErr w:type="gramStart"/>
-      <w:r>
-        <w:rPr>
-          <w:lang w:val="en-GB"/>
-        </w:rPr>
-        <w:t>setRate</w:t>
-      </w:r>
-      <w:proofErr w:type="spellEnd"/>
-      <w:r>
-        <w:rPr>
-          <w:lang w:val="en-GB"/>
-        </w:rPr>
-        <w:t>(</w:t>
-      </w:r>
-      <w:proofErr w:type="gramEnd"/>
-      <w:r>
-        <w:rPr>
-          <w:lang w:val="en-GB"/>
-        </w:rPr>
-        <w:t>) (</w:t>
-      </w:r>
-      <w:proofErr w:type="spellStart"/>
-      <w:r>
-        <w:rPr>
-          <w:lang w:val="en-GB"/>
-        </w:rPr>
-        <w:t>device.lua</w:t>
-      </w:r>
-      <w:proofErr w:type="spellEnd"/>
-      <w:r>
-        <w:rPr>
-          <w:lang w:val="en-GB"/>
-        </w:rPr>
-        <w:t>)</w:t>
-      </w:r>
-    </w:p>
-    <w:p>
-      <w:pPr>
-        <w:rPr>
-          <w:lang w:val="en-GB"/>
-        </w:rPr>
-      </w:pPr>
-      <w:r>
-        <w:rPr>
-          <w:lang w:val="en-GB"/>
-        </w:rPr>
-        <w:t xml:space="preserve">-start with easier </w:t>
-      </w:r>
-      <w:proofErr w:type="spellStart"/>
-      <w:r>
-        <w:rPr>
-          <w:lang w:val="en-GB"/>
-        </w:rPr>
-        <w:t>moongen</w:t>
-      </w:r>
-      <w:proofErr w:type="spellEnd"/>
-      <w:r>
-        <w:rPr>
-          <w:lang w:val="en-GB"/>
-        </w:rPr>
-        <w:t xml:space="preserve"> script</w:t>
-      </w:r>
-    </w:p>
-    <w:p>
-      <w:pPr>
-        <w:rPr>
-          <w:lang w:val="en-GB"/>
-        </w:rPr>
-      </w:pPr>
-      <w:r>
-        <w:rPr>
-          <w:lang w:val="en-GB"/>
-        </w:rPr>
-        <w:t>-</w:t>
-      </w:r>
-    </w:p>
-    <w:p>
-      <w:pPr>
-        <w:rPr>
-          <w:lang w:val="en-GB"/>
-        </w:rPr>
-      </w:pPr>
-    </w:p>
-    <w:p>
-      <w:pPr>
-        <w:rPr>
-          <w:lang w:val="en-GB"/>
-        </w:rPr>
-      </w:pPr>
-    </w:p>
-    <w:p>
-      <w:pPr>
-        <w:rPr>
-          <w:lang w:val="en-GB"/>
-        </w:rPr>
-      </w:pPr>
-    </w:p>
-    <w:p>
-      <w:pPr>
-        <w:rPr>
-          <w:lang w:val="en-GB"/>
-        </w:rPr>
-      </w:pPr>
-    </w:p>
-    <w:p>
-      <w:pPr>
-        <w:rPr>
-          <w:lang w:val="en-GB"/>
-        </w:rPr>
-      </w:pPr>
-    </w:p>
-    <w:p>
-      <w:pPr>
-        <w:rPr>
-          <w:lang w:val="en-GB"/>
-        </w:rPr>
-      </w:pPr>
-    </w:p>
-    <w:p>
-      <w:pPr>
-        <w:rPr>
-          <w:lang w:val="en-GB"/>
-        </w:rPr>
-      </w:pPr>
-    </w:p>
-    <w:p>
-      <w:pPr>
-        <w:rPr>
-          <w:lang w:val="en-GB"/>
-        </w:rPr>
-      </w:pPr>
-    </w:p>
-    <w:p>
-      <w:pPr>
-        <w:rPr>
-          <w:lang w:val="en-GB"/>
-        </w:rPr>
-      </w:pPr>
-    </w:p>
-    <w:p>
-      <w:pPr>
-        <w:rPr>
-          <w:lang w:val="en-GB"/>
-        </w:rPr>
-      </w:pPr>
-    </w:p>
-    <w:p>
-      <w:r>
-        <w:t xml:space="preserve">-Ergebnisse am Ende mit NS-3 und </w:t>
-      </w:r>
-      <w:proofErr w:type="spellStart"/>
-      <w:r>
-        <w:t>Omnet</w:t>
-      </w:r>
-      <w:proofErr w:type="spellEnd"/>
-      <w:r>
-        <w:t>++ vergleichen</w:t>
+    </w:p>
+    <w:p>
+      <w:pPr>
+        <w:rPr>
+          <w:lang w:val="en-GB"/>
+        </w:rPr>
+      </w:pPr>
+    </w:p>
+    <w:p>
+      <w:pPr>
+        <w:rPr>
+          <w:lang w:val="en-GB"/>
+        </w:rPr>
+      </w:pPr>
+    </w:p>
+    <w:p>
+      <w:pPr>
+        <w:rPr>
+          <w:lang w:val="en-GB"/>
+        </w:rPr>
+      </w:pPr>
+    </w:p>
+    <w:p>
+      <w:pPr>
+        <w:rPr>
+          <w:lang w:val="en-GB"/>
+        </w:rPr>
+      </w:pPr>
+    </w:p>
+    <w:p>
+      <w:pPr>
+        <w:rPr>
+          <w:lang w:val="en-GB"/>
+        </w:rPr>
+      </w:pPr>
+    </w:p>
+    <w:p>
+      <w:pPr>
+        <w:rPr>
+          <w:lang w:val="en-GB"/>
+        </w:rPr>
+      </w:pPr>
+    </w:p>
+    <w:p>
+      <w:pPr>
+        <w:rPr>
+          <w:lang w:val="en-GB"/>
+        </w:rPr>
+      </w:pPr>
+    </w:p>
+    <w:p>
+      <w:pPr>
+        <w:rPr>
+          <w:lang w:val="en-GB"/>
+        </w:rPr>
+      </w:pPr>
+    </w:p>
+    <w:p>
+      <w:pPr>
+        <w:rPr>
+          <w:lang w:val="en-GB"/>
+        </w:rPr>
+      </w:pPr>
+    </w:p>
+    <w:p>
+      <w:pPr>
+        <w:rPr>
+          <w:lang w:val="en-GB"/>
+        </w:rPr>
+      </w:pPr>
+    </w:p>
+    <w:p>
+      <w:r>
+        <w:t>-Ergebnisse am Ende mit NS-3 und Omnet++ vergleichen</w:t>
       </w:r>
     </w:p>
     <w:p/>
@@ -1084,21 +945,7 @@
         <w:rPr>
           <w:lang w:val="en-GB"/>
         </w:rPr>
-        <w:t>(</w:t>
-      </w:r>
-      <w:proofErr w:type="gramStart"/>
-      <w:r>
-        <w:rPr>
-          <w:lang w:val="en-GB"/>
-        </w:rPr>
-        <w:t>3.waits</w:t>
-      </w:r>
-      <w:proofErr w:type="gramEnd"/>
-      <w:r>
-        <w:rPr>
-          <w:lang w:val="en-GB"/>
-        </w:rPr>
-        <w:t xml:space="preserve"> for acknowledgement and resents if there is none)</w:t>
+        <w:t>(3.waits for acknowledgement and resents if there is none)</w:t>
       </w:r>
     </w:p>
     <w:p>

</xml_diff>

<commit_message>
got BER to moongen (i hope)
</commit_message>
<xml_diff>
--- a/Notes.docx
+++ b/Notes.docx
@@ -112,6 +112,12 @@
         </w:rPr>
         <w:t>-</w:t>
       </w:r>
+      <w:r>
+        <w:rPr>
+          <w:lang w:val="en-GB"/>
+        </w:rPr>
+        <w:t>BER/SNR on Console</w:t>
+      </w:r>
     </w:p>
     <w:p>
       <w:pPr>
@@ -176,13 +182,13 @@
         <w:rPr>
           <w:lang w:val="en-GB"/>
         </w:rPr>
-        <w:t>-DataRecorder.cs</w:t>
-      </w:r>
-      <w:r>
-        <w:rPr>
-          <w:lang w:val="en-GB"/>
-        </w:rPr>
-        <w:t xml:space="preserve"> //BER+SNR</w:t>
+        <w:t>-</w:t>
+      </w:r>
+      <w:r>
+        <w:rPr>
+          <w:lang w:val="en-GB"/>
+        </w:rPr>
+        <w:t>create new “UE” -&gt; FFD (+maybe RFD)</w:t>
       </w:r>
       <w:r>
         <w:rPr>
@@ -207,13 +213,123 @@
         <w:rPr>
           <w:lang w:val="en-GB"/>
         </w:rPr>
-        <w:t>create new “UE” -&gt; FFD (+maybe RFD)</w:t>
-      </w:r>
-      <w:r>
-        <w:rPr>
-          <w:lang w:val="en-GB"/>
-        </w:rPr>
-        <w:t>?</w:t>
+        <w:t>change filepaths</w:t>
+      </w:r>
+    </w:p>
+    <w:p>
+      <w:pPr>
+        <w:rPr>
+          <w:lang w:val="en-GB"/>
+        </w:rPr>
+      </w:pPr>
+      <w:r>
+        <w:rPr>
+          <w:lang w:val="en-GB"/>
+        </w:rPr>
+        <w:t>-SCPFile.cs</w:t>
+      </w:r>
+    </w:p>
+    <w:p>
+      <w:pPr>
+        <w:rPr>
+          <w:lang w:val="en-GB"/>
+        </w:rPr>
+      </w:pPr>
+      <w:r>
+        <w:rPr>
+          <w:lang w:val="en-GB"/>
+        </w:rPr>
+        <w:t>-PSCPReceiveFile.cs</w:t>
+      </w:r>
+    </w:p>
+    <w:p>
+      <w:pPr>
+        <w:rPr>
+          <w:lang w:val="en-GB"/>
+        </w:rPr>
+      </w:pPr>
+      <w:r>
+        <w:rPr>
+          <w:lang w:val="en-GB"/>
+        </w:rPr>
+        <w:t>-PSCPSendFile.cs, Filepaths etc</w:t>
+      </w:r>
+    </w:p>
+    <w:p>
+      <w:pPr>
+        <w:rPr>
+          <w:lang w:val="en-GB"/>
+        </w:rPr>
+      </w:pPr>
+      <w:r>
+        <w:rPr>
+          <w:lang w:val="en-GB"/>
+        </w:rPr>
+        <w:t>-TxPower.cs</w:t>
+      </w:r>
+    </w:p>
+    <w:p>
+      <w:pPr>
+        <w:rPr>
+          <w:lang w:val="en-GB"/>
+        </w:rPr>
+      </w:pPr>
+      <w:r>
+        <w:rPr>
+          <w:lang w:val="en-GB"/>
+        </w:rPr>
+        <w:t>-UeParameters.cs</w:t>
+      </w:r>
+      <w:r>
+        <w:rPr>
+          <w:lang w:val="en-GB"/>
+        </w:rPr>
+        <w:t xml:space="preserve"> (device properties)</w:t>
+      </w:r>
+    </w:p>
+    <w:p>
+      <w:pPr>
+        <w:rPr>
+          <w:lang w:val="en-GB"/>
+        </w:rPr>
+      </w:pPr>
+      <w:r>
+        <w:rPr>
+          <w:lang w:val="en-GB"/>
+        </w:rPr>
+        <w:t>-Throughput in moongen</w:t>
+      </w:r>
+    </w:p>
+    <w:p>
+      <w:pPr>
+        <w:rPr>
+          <w:lang w:val="en-GB"/>
+        </w:rPr>
+      </w:pPr>
+      <w:r>
+        <w:rPr>
+          <w:lang w:val="en-GB"/>
+        </w:rPr>
+        <w:t>-get BER Value to moongen</w:t>
+      </w:r>
+    </w:p>
+    <w:p>
+      <w:pPr>
+        <w:rPr>
+          <w:lang w:val="en-GB"/>
+        </w:rPr>
+      </w:pPr>
+      <w:r>
+        <w:rPr>
+          <w:lang w:val="en-GB"/>
+        </w:rPr>
+        <w:t>-show BER and Throughput in Data</w:t>
+      </w:r>
+      <w:r>
+        <w:rPr>
+          <w:lang w:val="en-GB"/>
+        </w:rPr>
+        <w:t>Display.cs</w:t>
       </w:r>
     </w:p>
     <w:p>
@@ -232,209 +348,110 @@
         <w:rPr>
           <w:lang w:val="en-GB"/>
         </w:rPr>
-        <w:t>change filepaths</w:t>
-      </w:r>
-    </w:p>
-    <w:p>
-      <w:pPr>
-        <w:rPr>
-          <w:lang w:val="en-GB"/>
-        </w:rPr>
-      </w:pPr>
-      <w:r>
-        <w:rPr>
-          <w:lang w:val="en-GB"/>
-        </w:rPr>
-        <w:t>-SCPFile.cs</w:t>
-      </w:r>
-    </w:p>
-    <w:p>
-      <w:pPr>
-        <w:rPr>
-          <w:lang w:val="en-GB"/>
-        </w:rPr>
-      </w:pPr>
-      <w:r>
-        <w:rPr>
-          <w:lang w:val="en-GB"/>
-        </w:rPr>
-        <w:t>-PSCPReceiveFile.cs</w:t>
-      </w:r>
-    </w:p>
-    <w:p>
-      <w:pPr>
-        <w:rPr>
-          <w:lang w:val="en-GB"/>
-        </w:rPr>
-      </w:pPr>
-      <w:r>
-        <w:rPr>
-          <w:lang w:val="en-GB"/>
-        </w:rPr>
-        <w:t>-PSCPSendFile.cs, Filepaths etc</w:t>
-      </w:r>
-    </w:p>
-    <w:p>
-      <w:pPr>
-        <w:rPr>
-          <w:lang w:val="en-GB"/>
-        </w:rPr>
-      </w:pPr>
-      <w:r>
-        <w:rPr>
-          <w:lang w:val="en-GB"/>
-        </w:rPr>
-        <w:t>-TxPower.cs</w:t>
-      </w:r>
-    </w:p>
-    <w:p>
-      <w:pPr>
-        <w:rPr>
-          <w:lang w:val="en-GB"/>
-        </w:rPr>
-      </w:pPr>
-      <w:r>
-        <w:rPr>
-          <w:lang w:val="en-GB"/>
-        </w:rPr>
-        <w:t>-UeParameters.cs</w:t>
-      </w:r>
-      <w:r>
-        <w:rPr>
-          <w:lang w:val="en-GB"/>
-        </w:rPr>
-        <w:t xml:space="preserve"> (device properties)</w:t>
-      </w:r>
-    </w:p>
-    <w:p>
-      <w:pPr>
-        <w:rPr>
-          <w:lang w:val="en-GB"/>
-        </w:rPr>
-      </w:pPr>
-      <w:r>
-        <w:rPr>
-          <w:lang w:val="en-GB"/>
-        </w:rPr>
-        <w:t>-Throughput in moongen</w:t>
-      </w:r>
-    </w:p>
-    <w:p>
-      <w:pPr>
-        <w:rPr>
-          <w:lang w:val="en-GB"/>
-        </w:rPr>
-      </w:pPr>
-      <w:r>
-        <w:rPr>
-          <w:lang w:val="en-GB"/>
-        </w:rPr>
-        <w:t>-get BER Value to moongen</w:t>
-      </w:r>
-    </w:p>
-    <w:p>
-      <w:pPr>
-        <w:rPr>
-          <w:lang w:val="en-GB"/>
-        </w:rPr>
-      </w:pPr>
-      <w:r>
-        <w:rPr>
-          <w:lang w:val="en-GB"/>
-        </w:rPr>
-        <w:t>-show BER and Throughput in Data</w:t>
-      </w:r>
-      <w:r>
-        <w:rPr>
-          <w:lang w:val="en-GB"/>
-        </w:rPr>
-        <w:t>Display.cs</w:t>
-      </w:r>
-    </w:p>
-    <w:p>
-      <w:pPr>
-        <w:rPr>
-          <w:lang w:val="en-GB"/>
-        </w:rPr>
-      </w:pPr>
-      <w:r>
-        <w:rPr>
-          <w:lang w:val="en-GB"/>
-        </w:rPr>
+        <w:t>get Connection to emulab to work</w:t>
+      </w:r>
+    </w:p>
+    <w:p>
+      <w:pPr>
+        <w:rPr>
+          <w:lang w:val="en-GB"/>
+        </w:rPr>
+      </w:pPr>
+      <w:r>
+        <w:rPr>
+          <w:lang w:val="en-GB"/>
+        </w:rPr>
+        <w:t>-create scene for test</w:t>
+      </w:r>
+    </w:p>
+    <w:p>
+      <w:pPr>
+        <w:rPr>
+          <w:lang w:val="en-GB"/>
+        </w:rPr>
+      </w:pPr>
+      <w:r>
+        <w:rPr>
+          <w:lang w:val="en-GB"/>
+        </w:rPr>
+        <w:t>-look at BER while moving UE/FFD</w:t>
+      </w:r>
+    </w:p>
+    <w:p>
+      <w:pPr>
+        <w:rPr>
+          <w:lang w:val="en-GB"/>
+        </w:rPr>
+      </w:pPr>
+    </w:p>
+    <w:p>
+      <w:pPr>
+        <w:rPr>
+          <w:lang w:val="en-GB"/>
+        </w:rPr>
+      </w:pPr>
+      <w:r>
+        <w:rPr>
+          <w:lang w:val="en-GB"/>
+        </w:rPr>
+        <w:t>Advanced:</w:t>
+      </w:r>
+    </w:p>
+    <w:p>
+      <w:pPr>
+        <w:rPr>
+          <w:lang w:val="en-GB"/>
+        </w:rPr>
+      </w:pPr>
+      <w:r>
+        <w:rPr>
+          <w:lang w:val="en-GB"/>
+        </w:rPr>
+        <w:t>-Beacon mode</w:t>
+      </w:r>
+    </w:p>
+    <w:p>
+      <w:pPr>
+        <w:rPr>
+          <w:lang w:val="en-GB"/>
+        </w:rPr>
+      </w:pPr>
+      <w:r>
+        <w:rPr>
+          <w:lang w:val="en-GB"/>
+        </w:rPr>
+        <w:t>-Peer-to-peer</w:t>
+      </w:r>
+    </w:p>
+    <w:p>
+      <w:pPr>
+        <w:rPr>
+          <w:lang w:val="en-GB"/>
+        </w:rPr>
+      </w:pPr>
+    </w:p>
+    <w:p>
+      <w:pPr>
+        <w:rPr>
+          <w:lang w:val="en-GB"/>
+        </w:rPr>
+      </w:pPr>
+    </w:p>
+    <w:p>
+      <w:r>
+        <w:t>Questions:</w:t>
+      </w:r>
+    </w:p>
+    <w:p>
+      <w:pPr>
+        <w:rPr>
+          <w:lang w:val="en-GB"/>
+        </w:rPr>
+      </w:pPr>
+      <w:r>
         <w:t>-</w:t>
       </w:r>
       <w:r>
-        <w:rPr>
-          <w:lang w:val="en-GB"/>
-        </w:rPr>
-        <w:t>get Connection to emulab to work</w:t>
-      </w:r>
-    </w:p>
-    <w:p>
-      <w:pPr>
-        <w:rPr>
-          <w:lang w:val="en-GB"/>
-        </w:rPr>
-      </w:pPr>
-      <w:r>
-        <w:rPr>
-          <w:lang w:val="en-GB"/>
-        </w:rPr>
-        <w:t>-create scene for test</w:t>
-      </w:r>
-    </w:p>
-    <w:p>
-      <w:pPr>
-        <w:rPr>
-          <w:lang w:val="en-GB"/>
-        </w:rPr>
-      </w:pPr>
-      <w:r>
-        <w:rPr>
-          <w:lang w:val="en-GB"/>
-        </w:rPr>
-        <w:t>-look at BER while moving UE/FFD</w:t>
-      </w:r>
-    </w:p>
-    <w:p>
-      <w:pPr>
-        <w:rPr>
-          <w:lang w:val="en-GB"/>
-        </w:rPr>
-      </w:pPr>
-    </w:p>
-    <w:p>
-      <w:r>
-        <w:t>Advanced:</w:t>
-      </w:r>
-    </w:p>
-    <w:p>
-      <w:r>
-        <w:t>-Beacon mode</w:t>
-      </w:r>
-    </w:p>
-    <w:p>
-      <w:r>
-        <w:t>-Peer-to-peer</w:t>
-      </w:r>
-    </w:p>
-    <w:p/>
-    <w:p/>
-    <w:p>
-      <w:r>
-        <w:t>Questions:</w:t>
-      </w:r>
-    </w:p>
-    <w:p>
-      <w:pPr>
-        <w:rPr>
-          <w:lang w:val="en-GB"/>
-        </w:rPr>
-      </w:pPr>
-      <w:r>
-        <w:t>-</w:t>
-      </w:r>
-      <w:r>
         <w:t xml:space="preserve">was muss ich </w:t>
       </w:r>
       <w:r>
@@ -450,7 +467,7 @@
         <w:rPr>
           <w:lang w:val="en-GB"/>
         </w:rPr>
-        <w:t>(PCAP, socket.lua, …)</w:t>
+        <w:t>(PCAP, …)</w:t>
       </w:r>
     </w:p>
     <w:p>

</xml_diff>

<commit_message>
CSMA/CA Latency and Notes
</commit_message>
<xml_diff>
--- a/Notes.docx
+++ b/Notes.docx
@@ -129,58 +129,34 @@
         <w:rPr>
           <w:lang w:val="en-GB"/>
         </w:rPr>
-        <w:t xml:space="preserve">-change </w:t>
-      </w:r>
-      <w:proofErr w:type="spellStart"/>
-      <w:r>
-        <w:rPr>
-          <w:lang w:val="en-GB"/>
-        </w:rPr>
-        <w:t>filepaths</w:t>
-      </w:r>
-      <w:proofErr w:type="spellEnd"/>
-    </w:p>
-    <w:p>
-      <w:pPr>
-        <w:rPr>
-          <w:lang w:val="en-GB"/>
-        </w:rPr>
-      </w:pPr>
-      <w:r>
-        <w:rPr>
-          <w:lang w:val="en-GB"/>
-        </w:rPr>
-        <w:t xml:space="preserve">-get BER Value to </w:t>
-      </w:r>
-      <w:proofErr w:type="spellStart"/>
-      <w:r>
-        <w:rPr>
-          <w:lang w:val="en-GB"/>
-        </w:rPr>
-        <w:t>moongen</w:t>
-      </w:r>
-      <w:proofErr w:type="spellEnd"/>
-    </w:p>
-    <w:p>
-      <w:pPr>
-        <w:rPr>
-          <w:lang w:val="en-GB"/>
-        </w:rPr>
-      </w:pPr>
-      <w:r>
-        <w:rPr>
-          <w:lang w:val="en-GB"/>
-        </w:rPr>
-        <w:t xml:space="preserve">-tests with devices, install </w:t>
-      </w:r>
-      <w:proofErr w:type="spellStart"/>
-      <w:r>
-        <w:rPr>
-          <w:lang w:val="en-GB"/>
-        </w:rPr>
-        <w:t>homeassistant</w:t>
-      </w:r>
-      <w:proofErr w:type="spellEnd"/>
+        <w:t>-change filepaths</w:t>
+      </w:r>
+    </w:p>
+    <w:p>
+      <w:pPr>
+        <w:rPr>
+          <w:lang w:val="en-GB"/>
+        </w:rPr>
+      </w:pPr>
+      <w:r>
+        <w:rPr>
+          <w:lang w:val="en-GB"/>
+        </w:rPr>
+        <w:t>-get BER Value to moongen</w:t>
+      </w:r>
+    </w:p>
+    <w:p>
+      <w:pPr>
+        <w:rPr>
+          <w:lang w:val="en-GB"/>
+        </w:rPr>
+      </w:pPr>
+      <w:r>
+        <w:rPr>
+          <w:lang w:val="en-GB"/>
+        </w:rPr>
+        <w:t>-tests with devices, install homeassistant</w:t>
+      </w:r>
     </w:p>
     <w:p>
       <w:pPr>
@@ -214,6 +190,26 @@
           <w:lang w:val="en-GB"/>
         </w:rPr>
       </w:pPr>
+      <w:r>
+        <w:rPr>
+          <w:lang w:val="en-GB"/>
+        </w:rPr>
+        <w:t>-Latency (of CSMA/CA, …)</w:t>
+      </w:r>
+    </w:p>
+    <w:p>
+      <w:pPr>
+        <w:rPr>
+          <w:lang w:val="en-GB"/>
+        </w:rPr>
+      </w:pPr>
+    </w:p>
+    <w:p>
+      <w:pPr>
+        <w:rPr>
+          <w:lang w:val="en-GB"/>
+        </w:rPr>
+      </w:pPr>
     </w:p>
     <w:p>
       <w:pPr>
@@ -266,20 +262,7 @@
         <w:rPr>
           <w:lang w:val="en-GB"/>
         </w:rPr>
-        <w:t>-ask Liu to take a look</w:t>
-      </w:r>
-    </w:p>
-    <w:p>
-      <w:pPr>
-        <w:rPr>
-          <w:lang w:val="en-GB"/>
-        </w:rPr>
-      </w:pPr>
-      <w:r>
-        <w:rPr>
-          <w:lang w:val="en-GB"/>
-        </w:rPr>
-        <w:t>-noise value</w:t>
+        <w:t>-add iperf to tools in paper</w:t>
       </w:r>
     </w:p>
     <w:p>
@@ -294,19 +277,103 @@
         </w:rPr>
         <w:t>-</w:t>
       </w:r>
-      <w:proofErr w:type="spellStart"/>
-      <w:r>
-        <w:rPr>
-          <w:lang w:val="en-GB"/>
-        </w:rPr>
-        <w:t>sinr</w:t>
-      </w:r>
-      <w:proofErr w:type="spellEnd"/>
-      <w:r>
-        <w:rPr>
-          <w:lang w:val="en-GB"/>
-        </w:rPr>
-        <w:t xml:space="preserve"> equation? Found Signal/(Interferences + Noise) but is Signal - Interferences - Noise</w:t>
+      <w:r>
+        <w:rPr>
+          <w:lang w:val="en-GB"/>
+        </w:rPr>
+        <w:t>implement latency of csma/ca, remove harq latency</w:t>
+      </w:r>
+      <w:r>
+        <w:rPr>
+          <w:lang w:val="en-GB"/>
+        </w:rPr>
+        <w:t xml:space="preserve"> (done?)</w:t>
+      </w:r>
+    </w:p>
+    <w:p>
+      <w:pPr>
+        <w:rPr>
+          <w:lang w:val="en-GB"/>
+        </w:rPr>
+      </w:pPr>
+      <w:r>
+        <w:rPr>
+          <w:lang w:val="en-GB"/>
+        </w:rPr>
+        <w:t>-Iperf server doesn’t receive packets</w:t>
+      </w:r>
+    </w:p>
+    <w:p>
+      <w:pPr>
+        <w:rPr>
+          <w:lang w:val="en-GB"/>
+        </w:rPr>
+      </w:pPr>
+    </w:p>
+    <w:p>
+      <w:pPr>
+        <w:rPr>
+          <w:lang w:val="en-GB"/>
+        </w:rPr>
+      </w:pPr>
+    </w:p>
+    <w:p>
+      <w:pPr>
+        <w:rPr>
+          <w:lang w:val="en-GB"/>
+        </w:rPr>
+      </w:pPr>
+      <w:r>
+        <w:rPr>
+          <w:lang w:val="en-GB"/>
+        </w:rPr>
+        <w:t>Advanced:</w:t>
+      </w:r>
+    </w:p>
+    <w:p>
+      <w:pPr>
+        <w:rPr>
+          <w:lang w:val="en-GB"/>
+        </w:rPr>
+      </w:pPr>
+      <w:r>
+        <w:rPr>
+          <w:lang w:val="en-GB"/>
+        </w:rPr>
+        <w:t>-Beacon mode</w:t>
+      </w:r>
+    </w:p>
+    <w:p>
+      <w:pPr>
+        <w:rPr>
+          <w:lang w:val="en-GB"/>
+        </w:rPr>
+      </w:pPr>
+      <w:r>
+        <w:rPr>
+          <w:lang w:val="en-GB"/>
+        </w:rPr>
+        <w:t>-Peer-to-peer</w:t>
+      </w:r>
+    </w:p>
+    <w:p>
+      <w:pPr>
+        <w:rPr>
+          <w:lang w:val="en-GB"/>
+        </w:rPr>
+      </w:pPr>
+    </w:p>
+    <w:p>
+      <w:pPr>
+        <w:rPr>
+          <w:lang w:val="en-GB"/>
+        </w:rPr>
+      </w:pPr>
+      <w:r>
+        <w:rPr>
+          <w:lang w:val="en-GB"/>
+        </w:rPr>
+        <w:t>Questions:</w:t>
       </w:r>
     </w:p>
     <w:p>
@@ -321,64 +388,162 @@
         </w:rPr>
         <w:t>-</w:t>
       </w:r>
-      <w:proofErr w:type="spellStart"/>
-      <w:r>
-        <w:rPr>
-          <w:lang w:val="en-GB"/>
-        </w:rPr>
-        <w:t>TxPower.cs</w:t>
-      </w:r>
-      <w:proofErr w:type="spellEnd"/>
-      <w:r>
-        <w:rPr>
-          <w:lang w:val="en-GB"/>
-        </w:rPr>
-        <w:t xml:space="preserve"> ?</w:t>
-      </w:r>
-    </w:p>
-    <w:p>
-      <w:pPr>
-        <w:rPr>
-          <w:lang w:val="en-GB"/>
-        </w:rPr>
-      </w:pPr>
-      <w:r>
-        <w:rPr>
-          <w:lang w:val="en-GB"/>
-        </w:rPr>
+      <w:r>
+        <w:rPr>
+          <w:lang w:val="en-GB"/>
+        </w:rPr>
+        <w:t>O</w:t>
+      </w:r>
+      <w:r>
+        <w:rPr>
+          <w:lang w:val="en-GB"/>
+        </w:rPr>
+        <w:t>mnet++ not used at all?</w:t>
+      </w:r>
+    </w:p>
+    <w:p>
+      <w:pPr>
+        <w:rPr>
+          <w:lang w:val="en-GB"/>
+        </w:rPr>
+      </w:pPr>
+    </w:p>
+    <w:p>
+      <w:r>
+        <w:t>To Do (schreiben):</w:t>
+      </w:r>
+    </w:p>
+    <w:p>
+      <w:r>
         <w:t>-</w:t>
       </w:r>
-      <w:proofErr w:type="spellStart"/>
-      <w:r>
-        <w:rPr>
-          <w:lang w:val="en-GB"/>
-        </w:rPr>
-        <w:t>UeParameters.cs</w:t>
-      </w:r>
-      <w:proofErr w:type="spellEnd"/>
-      <w:r>
-        <w:rPr>
-          <w:lang w:val="en-GB"/>
-        </w:rPr>
-        <w:t xml:space="preserve"> (</w:t>
-      </w:r>
-      <w:r>
-        <w:rPr>
-          <w:lang w:val="en-GB"/>
-        </w:rPr>
-        <w:t xml:space="preserve">get </w:t>
-      </w:r>
-      <w:r>
-        <w:rPr>
-          <w:lang w:val="en-GB"/>
-        </w:rPr>
-        <w:t>device properties</w:t>
-      </w:r>
-      <w:r>
-        <w:rPr>
-          <w:lang w:val="en-GB"/>
-        </w:rPr>
-        <w:t xml:space="preserve"> right</w:t>
+      <w:r>
+        <w:t>Andere 802.15.4 Simulationen aufzählen und b</w:t>
+      </w:r>
+      <w:r>
+        <w:t>ewerten</w:t>
+      </w:r>
+    </w:p>
+    <w:p>
+      <w:pPr>
+        <w:rPr>
+          <w:lang w:val="en-GB"/>
+        </w:rPr>
+      </w:pPr>
+      <w:r>
+        <w:rPr>
+          <w:lang w:val="en-GB"/>
+        </w:rPr>
+        <w:t>-</w:t>
+      </w:r>
+    </w:p>
+    <w:p>
+      <w:pPr>
+        <w:rPr>
+          <w:lang w:val="en-GB"/>
+        </w:rPr>
+      </w:pPr>
+    </w:p>
+    <w:p>
+      <w:pPr>
+        <w:rPr>
+          <w:lang w:val="en-GB"/>
+        </w:rPr>
+      </w:pPr>
+    </w:p>
+    <w:p>
+      <w:pPr>
+        <w:rPr>
+          <w:lang w:val="en-GB"/>
+        </w:rPr>
+      </w:pPr>
+      <w:r>
+        <w:rPr>
+          <w:lang w:val="en-GB"/>
+        </w:rPr>
+        <w:t>Notes:</w:t>
+      </w:r>
+    </w:p>
+    <w:p>
+      <w:pPr>
+        <w:rPr>
+          <w:lang w:val="en-GB"/>
+        </w:rPr>
+      </w:pPr>
+      <w:r>
+        <w:rPr>
+          <w:lang w:val="en-GB"/>
+        </w:rPr>
+        <w:t>-5.4.2 Data transfer model</w:t>
+      </w:r>
+    </w:p>
+    <w:p>
+      <w:pPr>
+        <w:rPr>
+          <w:lang w:val="en-GB"/>
+        </w:rPr>
+      </w:pPr>
+      <w:r>
+        <w:rPr>
+          <w:lang w:val="en-GB"/>
+        </w:rPr>
+        <w:t>-</w:t>
+      </w:r>
+      <w:r>
+        <w:rPr>
+          <w:lang w:val="en-GB"/>
+        </w:rPr>
+        <w:t>5.4.3 Frame structure</w:t>
+      </w:r>
+    </w:p>
+    <w:p>
+      <w:pPr>
+        <w:rPr>
+          <w:lang w:val="en-GB"/>
+        </w:rPr>
+      </w:pPr>
+      <w:r>
+        <w:rPr>
+          <w:lang w:val="en-GB"/>
+        </w:rPr>
+        <w:t>-</w:t>
+      </w:r>
+      <w:r>
+        <w:rPr>
+          <w:lang w:val="en-GB"/>
+        </w:rPr>
+        <w:t>5.4.4.1 CSMA-CA mechanism</w:t>
+      </w:r>
+    </w:p>
+    <w:p>
+      <w:pPr>
+        <w:rPr>
+          <w:lang w:val="en-GB"/>
+        </w:rPr>
+      </w:pPr>
+      <w:r>
+        <w:rPr>
+          <w:lang w:val="en-GB"/>
+        </w:rPr>
+        <w:t>-</w:t>
+      </w:r>
+      <w:r>
+        <w:rPr>
+          <w:lang w:val="en-GB"/>
+        </w:rPr>
+        <w:t>7.2.1.8 FCS field</w:t>
+      </w:r>
+      <w:r>
+        <w:rPr>
+          <w:lang w:val="en-GB"/>
+        </w:rPr>
+        <w:t xml:space="preserve"> (error detection</w:t>
+      </w:r>
+      <w:r>
+        <w:rPr>
+          <w:lang w:val="en-GB"/>
+        </w:rPr>
+        <w:t xml:space="preserve"> only</w:t>
       </w:r>
       <w:r>
         <w:rPr>
@@ -397,125 +562,13 @@
         <w:rPr>
           <w:lang w:val="en-GB"/>
         </w:rPr>
-        <w:t xml:space="preserve">-Throughput in </w:t>
-      </w:r>
-      <w:proofErr w:type="spellStart"/>
-      <w:r>
-        <w:rPr>
-          <w:lang w:val="en-GB"/>
-        </w:rPr>
-        <w:t>moongen</w:t>
-      </w:r>
-      <w:proofErr w:type="spellEnd"/>
-    </w:p>
-    <w:p>
-      <w:pPr>
-        <w:rPr>
-          <w:lang w:val="en-GB"/>
-        </w:rPr>
-      </w:pPr>
-      <w:r>
-        <w:rPr>
-          <w:lang w:val="en-GB"/>
-        </w:rPr>
-        <w:t xml:space="preserve">-Latency </w:t>
-      </w:r>
-      <w:r>
-        <w:rPr>
-          <w:lang w:val="en-GB"/>
-        </w:rPr>
-        <w:t>(</w:t>
-      </w:r>
-      <w:r>
-        <w:rPr>
-          <w:lang w:val="en-GB"/>
-        </w:rPr>
-        <w:t>of CSMA/CA</w:t>
-      </w:r>
-      <w:r>
-        <w:rPr>
-          <w:lang w:val="en-GB"/>
-        </w:rPr>
-        <w:t>, …)</w:t>
-      </w:r>
-    </w:p>
-    <w:p>
-      <w:pPr>
-        <w:rPr>
-          <w:lang w:val="en-GB"/>
-        </w:rPr>
-      </w:pPr>
-      <w:r>
-        <w:rPr>
-          <w:lang w:val="en-GB"/>
-        </w:rPr>
         <w:t>-</w:t>
       </w:r>
-    </w:p>
-    <w:p>
-      <w:pPr>
-        <w:rPr>
-          <w:lang w:val="en-GB"/>
-        </w:rPr>
-      </w:pPr>
-    </w:p>
-    <w:p>
-      <w:pPr>
-        <w:rPr>
-          <w:lang w:val="en-GB"/>
-        </w:rPr>
-      </w:pPr>
-      <w:r>
-        <w:rPr>
-          <w:lang w:val="en-GB"/>
-        </w:rPr>
-        <w:t>Advanced:</w:t>
-      </w:r>
-    </w:p>
-    <w:p>
-      <w:pPr>
-        <w:rPr>
-          <w:lang w:val="en-GB"/>
-        </w:rPr>
-      </w:pPr>
-      <w:r>
-        <w:rPr>
-          <w:lang w:val="en-GB"/>
-        </w:rPr>
-        <w:t>-Beacon mode</w:t>
-      </w:r>
-    </w:p>
-    <w:p>
-      <w:pPr>
-        <w:rPr>
-          <w:lang w:val="en-GB"/>
-        </w:rPr>
-      </w:pPr>
-      <w:r>
-        <w:rPr>
-          <w:lang w:val="en-GB"/>
-        </w:rPr>
-        <w:t>-Peer-to-peer</w:t>
-      </w:r>
-    </w:p>
-    <w:p>
-      <w:pPr>
-        <w:rPr>
-          <w:lang w:val="en-GB"/>
-        </w:rPr>
-      </w:pPr>
-    </w:p>
-    <w:p>
-      <w:pPr>
-        <w:rPr>
-          <w:lang w:val="en-GB"/>
-        </w:rPr>
-      </w:pPr>
-      <w:r>
-        <w:rPr>
-          <w:lang w:val="en-GB"/>
-        </w:rPr>
-        <w:t>Questions:</w:t>
+      <w:r>
+        <w:rPr>
+          <w:lang w:val="en-GB"/>
+        </w:rPr>
+        <w:t>7.5.6.4 Use of acknowledgments</w:t>
       </w:r>
     </w:p>
     <w:p>
@@ -530,234 +583,26 @@
         </w:rPr>
         <w:t>-</w:t>
       </w:r>
-      <w:proofErr w:type="spellStart"/>
-      <w:r>
-        <w:rPr>
-          <w:lang w:val="en-GB"/>
-        </w:rPr>
-        <w:t>O</w:t>
-      </w:r>
-      <w:r>
-        <w:rPr>
-          <w:lang w:val="en-GB"/>
-        </w:rPr>
-        <w:t>mnet</w:t>
-      </w:r>
-      <w:proofErr w:type="spellEnd"/>
-      <w:r>
-        <w:rPr>
-          <w:lang w:val="en-GB"/>
-        </w:rPr>
-        <w:t>++ not used at all?</w:t>
-      </w:r>
-    </w:p>
-    <w:p>
-      <w:pPr>
-        <w:rPr>
-          <w:lang w:val="en-GB"/>
-        </w:rPr>
-      </w:pPr>
-    </w:p>
-    <w:p>
-      <w:proofErr w:type="spellStart"/>
-      <w:r>
-        <w:t>To</w:t>
-      </w:r>
-      <w:proofErr w:type="spellEnd"/>
-      <w:r>
-        <w:t xml:space="preserve"> Do (schreiben):</w:t>
-      </w:r>
-    </w:p>
-    <w:p>
-      <w:r>
+      <w:r>
+        <w:rPr>
+          <w:lang w:val="en-GB"/>
+        </w:rPr>
+        <w:t>7.5.6.4.1 No acknowledgment</w:t>
+      </w:r>
+    </w:p>
+    <w:p>
+      <w:pPr>
+        <w:rPr>
+          <w:lang w:val="en-GB"/>
+        </w:rPr>
+      </w:pPr>
+      <w:r>
+        <w:rPr>
+          <w:lang w:val="en-GB"/>
+        </w:rPr>
         <w:t>-</w:t>
       </w:r>
       <w:r>
-        <w:t>Andere 802.15.4 Simulationen aufzählen und b</w:t>
-      </w:r>
-      <w:r>
-        <w:t>ewerten</w:t>
-      </w:r>
-    </w:p>
-    <w:p>
-      <w:pPr>
-        <w:rPr>
-          <w:lang w:val="en-GB"/>
-        </w:rPr>
-      </w:pPr>
-      <w:r>
-        <w:rPr>
-          <w:lang w:val="en-GB"/>
-        </w:rPr>
-        <w:t>-</w:t>
-      </w:r>
-    </w:p>
-    <w:p>
-      <w:pPr>
-        <w:rPr>
-          <w:lang w:val="en-GB"/>
-        </w:rPr>
-      </w:pPr>
-    </w:p>
-    <w:p>
-      <w:pPr>
-        <w:rPr>
-          <w:lang w:val="en-GB"/>
-        </w:rPr>
-      </w:pPr>
-    </w:p>
-    <w:p>
-      <w:pPr>
-        <w:rPr>
-          <w:lang w:val="en-GB"/>
-        </w:rPr>
-      </w:pPr>
-      <w:r>
-        <w:rPr>
-          <w:lang w:val="en-GB"/>
-        </w:rPr>
-        <w:t>Notes:</w:t>
-      </w:r>
-    </w:p>
-    <w:p>
-      <w:pPr>
-        <w:rPr>
-          <w:lang w:val="en-GB"/>
-        </w:rPr>
-      </w:pPr>
-      <w:r>
-        <w:rPr>
-          <w:lang w:val="en-GB"/>
-        </w:rPr>
-        <w:t>-5.4.2 Data transfer model</w:t>
-      </w:r>
-    </w:p>
-    <w:p>
-      <w:pPr>
-        <w:rPr>
-          <w:lang w:val="en-GB"/>
-        </w:rPr>
-      </w:pPr>
-      <w:r>
-        <w:rPr>
-          <w:lang w:val="en-GB"/>
-        </w:rPr>
-        <w:t>-</w:t>
-      </w:r>
-      <w:r>
-        <w:rPr>
-          <w:lang w:val="en-GB"/>
-        </w:rPr>
-        <w:t>5.4.3 Frame structure</w:t>
-      </w:r>
-    </w:p>
-    <w:p>
-      <w:pPr>
-        <w:rPr>
-          <w:lang w:val="en-GB"/>
-        </w:rPr>
-      </w:pPr>
-      <w:r>
-        <w:rPr>
-          <w:lang w:val="en-GB"/>
-        </w:rPr>
-        <w:t>-</w:t>
-      </w:r>
-      <w:r>
-        <w:rPr>
-          <w:lang w:val="en-GB"/>
-        </w:rPr>
-        <w:t>5.4.4.1 CSMA-CA mechanism</w:t>
-      </w:r>
-    </w:p>
-    <w:p>
-      <w:pPr>
-        <w:rPr>
-          <w:lang w:val="en-GB"/>
-        </w:rPr>
-      </w:pPr>
-      <w:r>
-        <w:rPr>
-          <w:lang w:val="en-GB"/>
-        </w:rPr>
-        <w:t>-</w:t>
-      </w:r>
-      <w:r>
-        <w:rPr>
-          <w:lang w:val="en-GB"/>
-        </w:rPr>
-        <w:t>7.2.1.8 FCS field</w:t>
-      </w:r>
-      <w:r>
-        <w:rPr>
-          <w:lang w:val="en-GB"/>
-        </w:rPr>
-        <w:t xml:space="preserve"> (error detection</w:t>
-      </w:r>
-      <w:r>
-        <w:rPr>
-          <w:lang w:val="en-GB"/>
-        </w:rPr>
-        <w:t xml:space="preserve"> only</w:t>
-      </w:r>
-      <w:r>
-        <w:rPr>
-          <w:lang w:val="en-GB"/>
-        </w:rPr>
-        <w:t>)</w:t>
-      </w:r>
-    </w:p>
-    <w:p>
-      <w:pPr>
-        <w:rPr>
-          <w:lang w:val="en-GB"/>
-        </w:rPr>
-      </w:pPr>
-      <w:r>
-        <w:rPr>
-          <w:lang w:val="en-GB"/>
-        </w:rPr>
-        <w:t>-</w:t>
-      </w:r>
-      <w:r>
-        <w:rPr>
-          <w:lang w:val="en-GB"/>
-        </w:rPr>
-        <w:t>7.5.6.4 Use of acknowledgments</w:t>
-      </w:r>
-    </w:p>
-    <w:p>
-      <w:pPr>
-        <w:rPr>
-          <w:lang w:val="en-GB"/>
-        </w:rPr>
-      </w:pPr>
-      <w:r>
-        <w:rPr>
-          <w:lang w:val="en-GB"/>
-        </w:rPr>
-        <w:t>-</w:t>
-      </w:r>
-      <w:r>
-        <w:rPr>
-          <w:lang w:val="en-GB"/>
-        </w:rPr>
-        <w:t>7.5.6.4.1 No acknowledgment</w:t>
-      </w:r>
-    </w:p>
-    <w:p>
-      <w:pPr>
-        <w:rPr>
-          <w:lang w:val="en-GB"/>
-        </w:rPr>
-      </w:pPr>
-      <w:r>
-        <w:rPr>
-          <w:lang w:val="en-GB"/>
-        </w:rPr>
-        <w:t>-</w:t>
-      </w:r>
-      <w:r>
         <w:rPr>
           <w:lang w:val="en-GB"/>
         </w:rPr>
@@ -787,49 +632,7 @@
         <w:rPr>
           <w:lang w:val="en-GB"/>
         </w:rPr>
-        <w:t xml:space="preserve">-set rate of </w:t>
-      </w:r>
-      <w:proofErr w:type="spellStart"/>
-      <w:r>
-        <w:rPr>
-          <w:lang w:val="en-GB"/>
-        </w:rPr>
-        <w:t>TXQueue</w:t>
-      </w:r>
-      <w:proofErr w:type="spellEnd"/>
-      <w:r>
-        <w:rPr>
-          <w:lang w:val="en-GB"/>
-        </w:rPr>
-        <w:t xml:space="preserve"> with </w:t>
-      </w:r>
-      <w:proofErr w:type="spellStart"/>
-      <w:r>
-        <w:rPr>
-          <w:lang w:val="en-GB"/>
-        </w:rPr>
-        <w:t>setRate</w:t>
-      </w:r>
-      <w:proofErr w:type="spellEnd"/>
-      <w:r>
-        <w:rPr>
-          <w:lang w:val="en-GB"/>
-        </w:rPr>
-        <w:t>() (</w:t>
-      </w:r>
-      <w:proofErr w:type="spellStart"/>
-      <w:r>
-        <w:rPr>
-          <w:lang w:val="en-GB"/>
-        </w:rPr>
-        <w:t>device.lua</w:t>
-      </w:r>
-      <w:proofErr w:type="spellEnd"/>
-      <w:r>
-        <w:rPr>
-          <w:lang w:val="en-GB"/>
-        </w:rPr>
-        <w:t>)</w:t>
+        <w:t>-set rate of TXQueue with setRate() (device.lua)</w:t>
       </w:r>
     </w:p>
     <w:p>
@@ -849,15 +652,7 @@
     <w:p/>
     <w:p>
       <w:r>
-        <w:t xml:space="preserve">-Ergebnisse am Ende mit NS-3 und </w:t>
-      </w:r>
-      <w:proofErr w:type="spellStart"/>
-      <w:r>
-        <w:t>Omnet</w:t>
-      </w:r>
-      <w:proofErr w:type="spellEnd"/>
-      <w:r>
-        <w:t>++ vergleichen</w:t>
+        <w:t>-Ergebnisse am Ende mit NS-3 und Omnet++ vergleichen</w:t>
       </w:r>
       <w:r>
         <w:t>?</w:t>
@@ -1063,6 +858,142 @@
           <w:lang w:val="en-GB"/>
         </w:rPr>
         <w:t>ACKs are send without using CSMA/CA</w:t>
+      </w:r>
+    </w:p>
+    <w:p>
+      <w:pPr>
+        <w:rPr>
+          <w:lang w:val="en-GB"/>
+        </w:rPr>
+      </w:pPr>
+    </w:p>
+    <w:p>
+      <w:pPr>
+        <w:rPr>
+          <w:lang w:val="en-GB"/>
+        </w:rPr>
+      </w:pPr>
+    </w:p>
+    <w:p>
+      <w:pPr>
+        <w:rPr>
+          <w:lang w:val="en-GB"/>
+        </w:rPr>
+      </w:pPr>
+    </w:p>
+    <w:p>
+      <w:pPr>
+        <w:rPr>
+          <w:lang w:val="en-GB"/>
+        </w:rPr>
+      </w:pPr>
+    </w:p>
+    <w:p>
+      <w:pPr>
+        <w:rPr>
+          <w:lang w:val="en-GB"/>
+        </w:rPr>
+      </w:pPr>
+    </w:p>
+    <w:p>
+      <w:pPr>
+        <w:rPr>
+          <w:lang w:val="en-GB"/>
+        </w:rPr>
+      </w:pPr>
+    </w:p>
+    <w:p>
+      <w:pPr>
+        <w:jc w:val="both"/>
+        <w:rPr>
+          <w:lang w:val="en-GB"/>
+        </w:rPr>
+      </w:pPr>
+      <w:r>
+        <w:rPr>
+          <w:lang w:val="en-GB"/>
+        </w:rPr>
+        <w:drawing>
+          <wp:anchor distT="0" distB="0" distL="114300" distR="114300" simplePos="0" relativeHeight="251661312" behindDoc="0" locked="0" layoutInCell="1" allowOverlap="1" wp14:anchorId="476074CE" wp14:editId="5A6DE584">
+            <wp:simplePos x="0" y="0"/>
+            <wp:positionH relativeFrom="column">
+              <wp:posOffset>0</wp:posOffset>
+            </wp:positionH>
+            <wp:positionV relativeFrom="paragraph">
+              <wp:posOffset>180340</wp:posOffset>
+            </wp:positionV>
+            <wp:extent cx="6840220" cy="1105535"/>
+            <wp:effectExtent l="0" t="0" r="0" b="0"/>
+            <wp:wrapSquare wrapText="bothSides"/>
+            <wp:docPr id="1975892252" name="Grafik 1"/>
+            <wp:cNvGraphicFramePr>
+              <a:graphicFrameLocks xmlns:a="http://schemas.openxmlformats.org/drawingml/2006/main" noChangeAspect="1"/>
+            </wp:cNvGraphicFramePr>
+            <a:graphic xmlns:a="http://schemas.openxmlformats.org/drawingml/2006/main">
+              <a:graphicData uri="http://schemas.openxmlformats.org/drawingml/2006/picture">
+                <pic:pic xmlns:pic="http://schemas.openxmlformats.org/drawingml/2006/picture">
+                  <pic:nvPicPr>
+                    <pic:cNvPr id="1975892252" name=""/>
+                    <pic:cNvPicPr/>
+                  </pic:nvPicPr>
+                  <pic:blipFill>
+                    <a:blip r:embed="rId6"/>
+                    <a:stretch>
+                      <a:fillRect/>
+                    </a:stretch>
+                  </pic:blipFill>
+                  <pic:spPr>
+                    <a:xfrm>
+                      <a:off x="0" y="0"/>
+                      <a:ext cx="6840220" cy="1105535"/>
+                    </a:xfrm>
+                    <a:prstGeom prst="rect">
+                      <a:avLst/>
+                    </a:prstGeom>
+                  </pic:spPr>
+                </pic:pic>
+              </a:graphicData>
+            </a:graphic>
+          </wp:anchor>
+        </w:drawing>
+      </w:r>
+      <w:r>
+        <w:rPr>
+          <w:lang w:val="en-GB"/>
+        </w:rPr>
+        <w:t>CSMA/CA Backoff</w:t>
+      </w:r>
+      <w:r>
+        <w:rPr>
+          <w:lang w:val="en-GB"/>
+        </w:rPr>
+        <w:t>, BE is 3 by default and in this case max backoff is 2240us</w:t>
+      </w:r>
+      <w:r>
+        <w:rPr>
+          <w:lang w:val="en-GB"/>
+        </w:rPr>
+        <w:t xml:space="preserve"> = 2,24ms</w:t>
+      </w:r>
+      <w:r>
+        <w:rPr>
+          <w:lang w:val="en-GB"/>
+        </w:rPr>
+        <w:t xml:space="preserve"> and min is 0</w:t>
+      </w:r>
+    </w:p>
+    <w:p>
+      <w:pPr>
+        <w:jc w:val="both"/>
+        <w:rPr>
+          <w:lang w:val="en-GB"/>
+        </w:rPr>
+      </w:pPr>
+      <w:r>
+        <w:rPr>
+          <w:lang w:val="en-GB"/>
+        </w:rPr>
+        <w:t>https://de.wikipedia.org/wiki/IEEE_802.15.4</w:t>
       </w:r>
     </w:p>
     <w:sectPr>

</xml_diff>